<commit_message>
docs: ponencia EIIE 2026 actualizada y su investigacion de respaldo
Guarda la version de agosto de la ponencia junto con el respaldo de la
version de julio, para poder comparar o volver atras.

Co-Authored-By: Claude Opus 5 <noreply@anthropic.com>
Claude-Session: https://claude.ai/code/session_01W86TqFNCRfWax4W8x15zg8
</commit_message>
<xml_diff>
--- a/PONENCIA-EIIE-2026.docx
+++ b/PONENCIA-EIIE-2026.docx
@@ -2,128 +2,144 @@
 <file path=word/document.xml><?xml version="1.0" encoding="utf-8"?>
 <w:document xmlns:w="http://schemas.openxmlformats.org/wordprocessingml/2006/main" xmlns:m="http://schemas.openxmlformats.org/officeDocument/2006/math" xmlns:r="http://schemas.openxmlformats.org/officeDocument/2006/relationships" xmlns:o="urn:schemas-microsoft-com:office:office" xmlns:v="urn:schemas-microsoft-com:vml" xmlns:w10="urn:schemas-microsoft-com:office:word" xmlns:a="http://schemas.openxmlformats.org/drawingml/2006/main" xmlns:pic="http://schemas.openxmlformats.org/drawingml/2006/picture" xmlns:wp="http://schemas.openxmlformats.org/drawingml/2006/wordprocessingDrawing">
   <w:body>
-    <w:bookmarkStart w:id="20" w:name="X5c5a2a94d4573ebe1e8124a216a3d616f85e118"/>
+    <w:bookmarkStart w:id="24" w:name="X5c5a2a94d4573ebe1e8124a216a3d616f85e118"/>
     <w:p>
       <w:pPr>
         <w:pStyle w:val="Heading1"/>
-      </w:pPr>
-      <w:r>
+        <w:keepNext/>
+        <w:spacing w:line="360" w:lineRule="auto" w:before="80" w:after="40"/>
+      </w:pPr>
+      <w:r>
+        <w:rPr>
+          <w:rFonts w:ascii="Arial" w:hAnsi="Arial" w:cs="Arial" w:eastAsia="Arial"/>
+          <w:b/>
+          <w:sz w:val="24"/>
+        </w:rPr>
         <w:t xml:space="preserve">Ponencia — 2° EIIE</w:t>
       </w:r>
       <w:r>
-        <w:t xml:space="preserve"> </w:t>
-      </w:r>
-      <w:r>
+        <w:rPr>
+          <w:rFonts w:ascii="Arial" w:hAnsi="Arial" w:cs="Arial" w:eastAsia="Arial"/>
+          <w:b/>
+          <w:sz w:val="24"/>
+        </w:rPr>
+        <w:t xml:space="preserve"> </w:t>
+      </w:r>
+      <w:r>
+        <w:rPr>
+          <w:rFonts w:ascii="Arial" w:hAnsi="Arial" w:cs="Arial" w:eastAsia="Arial"/>
+          <w:b/>
+          <w:sz w:val="24"/>
+        </w:rPr>
         <w:t xml:space="preserve">“Pedagogías para el Mundo de Hoy”</w:t>
       </w:r>
       <w:r>
-        <w:t xml:space="preserve"> </w:t>
-      </w:r>
-      <w:r>
+        <w:rPr>
+          <w:rFonts w:ascii="Arial" w:hAnsi="Arial" w:cs="Arial" w:eastAsia="Arial"/>
+          <w:b/>
+          <w:sz w:val="24"/>
+        </w:rPr>
+        <w:t xml:space="preserve"> </w:t>
+      </w:r>
+      <w:r>
+        <w:rPr>
+          <w:rFonts w:ascii="Arial" w:hAnsi="Arial" w:cs="Arial" w:eastAsia="Arial"/>
+          <w:b/>
+          <w:sz w:val="24"/>
+        </w:rPr>
         <w:t xml:space="preserve">(Ibero Puebla)</w:t>
       </w:r>
     </w:p>
-    <w:p>
-      <w:pPr>
-        <w:pStyle w:val="BlockText"/>
-      </w:pPr>
-      <w:r>
-        <w:rPr>
-          <w:b/>
-          <w:bCs/>
-        </w:rPr>
-        <w:t xml:space="preserve">Instrucciones de formato al pasar a Word:</w:t>
-      </w:r>
-      <w:r>
-        <w:t xml:space="preserve"> </w:t>
-      </w:r>
-      <w:r>
-        <w:t xml:space="preserve">Arial 12, interlineado 1.5, títulos y subtítulos en negritas, máximo 10 cuartillas. Enviar como adjunto a</w:t>
-      </w:r>
-      <w:r>
-        <w:t xml:space="preserve"> </w:t>
-      </w:r>
-      <w:r>
-        <w:rPr>
-          <w:b/>
-          <w:bCs/>
-        </w:rPr>
-        <w:t xml:space="preserve">innovacion.educativa@iberopuebla.mx</w:t>
-      </w:r>
-      <w:r>
-        <w:t xml:space="preserve"> </w:t>
-      </w:r>
-      <w:r>
-        <w:t xml:space="preserve">antes del</w:t>
-      </w:r>
-      <w:r>
-        <w:t xml:space="preserve"> </w:t>
-      </w:r>
-      <w:r>
-        <w:rPr>
-          <w:b/>
-          <w:bCs/>
-        </w:rPr>
-        <w:t xml:space="preserve">16 de agosto de 2026</w:t>
-      </w:r>
-      <w:r>
-        <w:t xml:space="preserve">.</w:t>
-      </w:r>
-      <w:r>
-        <w:t xml:space="preserve"> </w:t>
-      </w:r>
-      <w:r>
-        <w:t xml:space="preserve">Los textos entre [corchetes] son datos que debes completar o ajustar tú.</w:t>
-      </w:r>
-    </w:p>
-    <w:p>
-      <w:r>
-        <w:pict>
-          <v:rect style="width:0;height:1.5pt" o:hralign="center" o:hrstd="t" o:hr="t"/>
-        </w:pict>
-      </w:r>
-    </w:p>
     <w:bookmarkStart w:id="9" w:name="a.-autoría"/>
     <w:p>
       <w:pPr>
         <w:pStyle w:val="Heading2"/>
-      </w:pPr>
-      <w:r>
+        <w:keepNext/>
+        <w:spacing w:line="360" w:lineRule="auto" w:before="80" w:after="40"/>
+      </w:pPr>
+      <w:r>
+        <w:rPr>
+          <w:rFonts w:ascii="Arial" w:hAnsi="Arial" w:cs="Arial" w:eastAsia="Arial"/>
+          <w:b/>
+          <w:sz w:val="24"/>
+        </w:rPr>
         <w:t xml:space="preserve">a. Autoría</w:t>
       </w:r>
     </w:p>
     <w:p>
       <w:pPr>
         <w:pStyle w:val="FirstParagraph"/>
-      </w:pPr>
-      <w:r>
+        <w:spacing w:line="360" w:lineRule="auto" w:before="0" w:after="0"/>
+        <w:jc w:val="both"/>
+      </w:pPr>
+      <w:r>
+        <w:rPr>
+          <w:rFonts w:ascii="Arial" w:hAnsi="Arial" w:cs="Arial" w:eastAsia="Arial"/>
+          <w:sz w:val="24"/>
+        </w:rPr>
         <w:t xml:space="preserve">José Roberto Mendoza [completa tu(s) apellido(s)]</w:t>
       </w:r>
       <w:r>
-        <w:t xml:space="preserve"> </w:t>
-      </w:r>
-      <w:r>
+        <w:rPr>
+          <w:rFonts w:ascii="Arial" w:hAnsi="Arial" w:cs="Arial" w:eastAsia="Arial"/>
+          <w:sz w:val="24"/>
+        </w:rPr>
+        <w:t xml:space="preserve"> </w:t>
+      </w:r>
+      <w:r>
+        <w:rPr>
+          <w:rFonts w:ascii="Arial" w:hAnsi="Arial" w:cs="Arial" w:eastAsia="Arial"/>
+          <w:sz w:val="24"/>
+        </w:rPr>
         <w:t xml:space="preserve">Docente de Cultura Digital y Educación Física, Bachillerato General Oficial</w:t>
       </w:r>
       <w:r>
-        <w:t xml:space="preserve"> </w:t>
-      </w:r>
-      <w:r>
+        <w:rPr>
+          <w:rFonts w:ascii="Arial" w:hAnsi="Arial" w:cs="Arial" w:eastAsia="Arial"/>
+          <w:sz w:val="24"/>
+        </w:rPr>
+        <w:t xml:space="preserve"> </w:t>
+      </w:r>
+      <w:r>
+        <w:rPr>
+          <w:rFonts w:ascii="Arial" w:hAnsi="Arial" w:cs="Arial" w:eastAsia="Arial"/>
+          <w:sz w:val="24"/>
+        </w:rPr>
         <w:t xml:space="preserve">“Carlos Camacho Espíritu”</w:t>
       </w:r>
       <w:r>
+        <w:rPr>
+          <w:rFonts w:ascii="Arial" w:hAnsi="Arial" w:cs="Arial" w:eastAsia="Arial"/>
+          <w:sz w:val="24"/>
+        </w:rPr>
         <w:t xml:space="preserve">, turno vespertino, Zona Escolar 013, Puebla, Pue.</w:t>
       </w:r>
       <w:r>
-        <w:t xml:space="preserve"> </w:t>
-      </w:r>
-      <w:r>
+        <w:rPr>
+          <w:rFonts w:ascii="Arial" w:hAnsi="Arial" w:cs="Arial" w:eastAsia="Arial"/>
+          <w:sz w:val="24"/>
+        </w:rPr>
+        <w:t xml:space="preserve"> </w:t>
+      </w:r>
+      <w:r>
+        <w:rPr>
+          <w:rFonts w:ascii="Arial" w:hAnsi="Arial" w:cs="Arial" w:eastAsia="Arial"/>
+          <w:sz w:val="24"/>
+        </w:rPr>
         <w:t xml:space="preserve">[Estudiante/egresado de — programa en la IBERO Puebla, si aplica]</w:t>
       </w:r>
       <w:r>
-        <w:t xml:space="preserve"> </w:t>
-      </w:r>
-      <w:r>
+        <w:rPr>
+          <w:rFonts w:ascii="Arial" w:hAnsi="Arial" w:cs="Arial" w:eastAsia="Arial"/>
+          <w:sz w:val="24"/>
+        </w:rPr>
+        <w:t xml:space="preserve"> </w:t>
+      </w:r>
+      <w:r>
+        <w:rPr>
+          <w:rFonts w:ascii="Arial" w:hAnsi="Arial" w:cs="Arial" w:eastAsia="Arial"/>
+          <w:sz w:val="24"/>
+        </w:rPr>
         <w:t xml:space="preserve">Correo: [tu correo de contacto]</w:t>
       </w:r>
     </w:p>
@@ -132,26 +148,45 @@
     <w:p>
       <w:pPr>
         <w:pStyle w:val="Heading2"/>
-      </w:pPr>
-      <w:r>
+        <w:keepNext/>
+        <w:spacing w:line="360" w:lineRule="auto" w:before="80" w:after="40"/>
+      </w:pPr>
+      <w:r>
+        <w:rPr>
+          <w:rFonts w:ascii="Arial" w:hAnsi="Arial" w:cs="Arial" w:eastAsia="Arial"/>
+          <w:b/>
+          <w:sz w:val="24"/>
+        </w:rPr>
         <w:t xml:space="preserve">b. Eje temático</w:t>
       </w:r>
     </w:p>
     <w:p>
       <w:pPr>
         <w:pStyle w:val="FirstParagraph"/>
-      </w:pPr>
-      <w:r>
-        <w:rPr>
+        <w:spacing w:line="360" w:lineRule="auto" w:before="0" w:after="0"/>
+        <w:jc w:val="both"/>
+      </w:pPr>
+      <w:r>
+        <w:rPr>
+          <w:rFonts w:ascii="Arial" w:hAnsi="Arial" w:cs="Arial" w:eastAsia="Arial"/>
           <w:b/>
           <w:bCs/>
+          <w:sz w:val="24"/>
         </w:rPr>
         <w:t xml:space="preserve">A) Alternativas para enseñar y aprender en un mundo hiperconectado</w:t>
       </w:r>
       <w:r>
-        <w:t xml:space="preserve"> </w:t>
-      </w:r>
-      <w:r>
+        <w:rPr>
+          <w:rFonts w:ascii="Arial" w:hAnsi="Arial" w:cs="Arial" w:eastAsia="Arial"/>
+          <w:sz w:val="24"/>
+        </w:rPr>
+        <w:t xml:space="preserve"> </w:t>
+      </w:r>
+      <w:r>
+        <w:rPr>
+          <w:rFonts w:ascii="Arial" w:hAnsi="Arial" w:cs="Arial" w:eastAsia="Arial"/>
+          <w:sz w:val="24"/>
+        </w:rPr>
         <w:t xml:space="preserve">— integración crítica y creativa de la inteligencia artificial y recursos tecnológicos en el aula; alfabetización digital para docentes.</w:t>
       </w:r>
     </w:p>
@@ -160,19 +195,30 @@
     <w:p>
       <w:pPr>
         <w:pStyle w:val="Heading2"/>
-      </w:pPr>
-      <w:r>
+        <w:keepNext/>
+        <w:spacing w:line="360" w:lineRule="auto" w:before="80" w:after="40"/>
+      </w:pPr>
+      <w:r>
+        <w:rPr>
+          <w:rFonts w:ascii="Arial" w:hAnsi="Arial" w:cs="Arial" w:eastAsia="Arial"/>
+          <w:b/>
+          <w:sz w:val="24"/>
+        </w:rPr>
         <w:t xml:space="preserve">c. Título</w:t>
       </w:r>
     </w:p>
     <w:p>
       <w:pPr>
         <w:pStyle w:val="FirstParagraph"/>
-      </w:pPr>
-      <w:r>
-        <w:rPr>
+        <w:spacing w:line="360" w:lineRule="auto" w:before="0" w:after="0"/>
+        <w:jc w:val="both"/>
+      </w:pPr>
+      <w:r>
+        <w:rPr>
+          <w:rFonts w:ascii="Arial" w:hAnsi="Arial" w:cs="Arial" w:eastAsia="Arial"/>
           <w:b/>
           <w:bCs/>
+          <w:sz w:val="24"/>
         </w:rPr>
         <w:t xml:space="preserve">EduPlan MX: de 50 minutos a 5 — una plataforma con inteligencia artificial, construida por un docente, para devolverle al profesorado de bachillerato su tiempo pedagógico</w:t>
       </w:r>
@@ -182,64 +228,300 @@
     <w:p>
       <w:pPr>
         <w:pStyle w:val="Heading2"/>
-      </w:pPr>
-      <w:r>
+        <w:keepNext/>
+        <w:spacing w:line="360" w:lineRule="auto" w:before="80" w:after="40"/>
+      </w:pPr>
+      <w:r>
+        <w:rPr>
+          <w:rFonts w:ascii="Arial" w:hAnsi="Arial" w:cs="Arial" w:eastAsia="Arial"/>
+          <w:b/>
+          <w:sz w:val="24"/>
+        </w:rPr>
         <w:t xml:space="preserve">d. Contexto</w:t>
       </w:r>
     </w:p>
     <w:p>
       <w:pPr>
         <w:pStyle w:val="FirstParagraph"/>
-      </w:pPr>
-      <w:r>
-        <w:t xml:space="preserve">El profesorado de los Bachilleratos Generales Oficiales del estado de Puebla enfrenta una paradoja cotidiana: el tiempo que debería dedicarse a diseñar buenas experiencias de aprendizaje se consume en producir documentos administrativos. La planeación didáctica alineada al Marco Curricular Común de la Educación Media Superior (MCCEMS) exige articular progresiones de aprendizaje oficiales, metas, categorías y subcategorías, vinculación con el Programa Aula-Escuela-Comunidad (PAEC), estrategias de inclusión (DUA), desglose socioemocional del currículum ampliado e instrumentos de evaluación — un formato que un docente tarda entre 40 y 50 minutos en completar por planeación, multiplicado por grupos, parciales y asignaturas, y revisado en cada Consejo Técnico Escolar.</w:t>
+        <w:spacing w:line="360" w:lineRule="auto" w:before="0" w:after="0"/>
+        <w:jc w:val="both"/>
+      </w:pPr>
+      <w:r>
+        <w:rPr>
+          <w:rFonts w:ascii="Arial" w:hAnsi="Arial" w:cs="Arial" w:eastAsia="Arial"/>
+          <w:sz w:val="24"/>
+        </w:rPr>
+        <w:t xml:space="preserve">El profesorado de los Bachilleratos Generales Oficiales de Puebla enfrenta una paradoja cotidiana: el tiempo que debería dedicarse a diseñar buenas experiencias de aprendizaje se consume en producir documentos administrativos. La planeación alineada al Marco Curricular Común de la Educación Media Superior (MCCEMS) exige articular progresiones oficiales, metas, categorías y subcategorías, vinculación con el Programa Aula-Escuela-Comunidad (PAEC), estrategias de inclusión (DUA), desglose socioemocional del currículum ampliado e instrumentos de evaluación — un formato que toma entre 40 y 50 minutos por planeación, multiplicado por grupos, parciales y asignaturas, y revisado en cada Consejo Técnico Escolar.</w:t>
       </w:r>
     </w:p>
     <w:p>
       <w:pPr>
         <w:pStyle w:val="BodyText"/>
-      </w:pPr>
-      <w:r>
-        <w:t xml:space="preserve">A esta carga se suma un momento curricular inusualmente complejo: conviven en las aulas dos planes de estudio (la generación 2023-2026 y la generación 2025-2028 del MCCEMS), con programas oficiales publicados en decenas de documentos PDF dispersos en el portal de la Dirección General del Bachillerato (DGB), difíciles de consultar en el momento de planear.</w:t>
+        <w:spacing w:line="360" w:lineRule="auto" w:before="0" w:after="0"/>
+        <w:jc w:val="both"/>
+      </w:pPr>
+      <w:r>
+        <w:rPr>
+          <w:rFonts w:ascii="Arial" w:hAnsi="Arial" w:cs="Arial" w:eastAsia="Arial"/>
+          <w:sz w:val="24"/>
+        </w:rPr>
+        <w:t xml:space="preserve">A ello se suma un momento curricular complejo: conviven en las aulas dos planes de estudio (generaciones 2023-2026 y 2025-2028 del MCCEMS), con programas oficiales publicados en decenas de PDF dispersos en el portal de la Dirección General del Bachillerato (DGB), difíciles de consultar al momento de planear.</w:t>
       </w:r>
     </w:p>
     <w:p>
       <w:pPr>
         <w:pStyle w:val="BodyText"/>
-      </w:pPr>
-      <w:r>
-        <w:t xml:space="preserve">Muchos docentes ya recurren a asistentes de IA conversacionales (ChatGPT, Gemini) para aliviar esta carga. Sin embargo, el chat genérico desconoce las progresiones oficiales, el formato que exige la supervisión escolar y — lo más importante — las características reales del grupo al que va dirigida la clase. El resultado suele ser una planeación genérica que</w:t>
-      </w:r>
-      <w:r>
-        <w:t xml:space="preserve"> </w:t>
-      </w:r>
-      <w:r>
-        <w:t xml:space="preserve">“cumple”</w:t>
-      </w:r>
-      <w:r>
-        <w:t xml:space="preserve"> </w:t>
-      </w:r>
-      <w:r>
-        <w:t xml:space="preserve">pero no transforma.</w:t>
+        <w:spacing w:line="360" w:lineRule="auto" w:before="0" w:after="0"/>
+        <w:jc w:val="both"/>
+      </w:pPr>
+      <w:r>
+        <w:rPr>
+          <w:rFonts w:ascii="Arial" w:hAnsi="Arial" w:cs="Arial" w:eastAsia="Arial"/>
+          <w:sz w:val="24"/>
+        </w:rPr>
+        <w:t xml:space="preserve">Esta carga no es una percepción local. TALIS 2024 (OCDE, 2025) documenta que el profesorado dedica en promedio siete horas semanales a preparar clases y tres al trabajo administrativo, y —el hallazgo más relevante aquí— que</w:t>
+      </w:r>
+      <w:r>
+        <w:rPr>
+          <w:rFonts w:ascii="Arial" w:hAnsi="Arial" w:cs="Arial" w:eastAsia="Arial"/>
+          <w:sz w:val="24"/>
+        </w:rPr>
+        <w:t xml:space="preserve"> </w:t>
+      </w:r>
+      <w:r>
+        <w:rPr>
+          <w:rFonts w:ascii="Arial" w:hAnsi="Arial" w:cs="Arial" w:eastAsia="Arial"/>
+          <w:b/>
+          <w:bCs/>
+          <w:sz w:val="24"/>
+        </w:rPr>
+        <w:t xml:space="preserve">el bienestar docente disminuye más con el tiempo administrativo que con cualquier otra actividad</w:t>
+      </w:r>
+      <w:r>
+        <w:rPr>
+          <w:rFonts w:ascii="Arial" w:hAnsi="Arial" w:cs="Arial" w:eastAsia="Arial"/>
+          <w:sz w:val="24"/>
+        </w:rPr>
+        <w:t xml:space="preserve">: un aumento de una desviación estándar en esas horas se asocia con una caída superior al 10% de desviación estándar en el bienestar. Reducir ese tiempo no es una mejora de gestión: es una intervención sobre las condiciones del trabajo docente.</w:t>
       </w:r>
     </w:p>
     <w:p>
       <w:pPr>
         <w:pStyle w:val="BodyText"/>
-      </w:pPr>
-      <w:r>
+        <w:spacing w:line="360" w:lineRule="auto" w:before="0" w:after="0"/>
+        <w:jc w:val="both"/>
+      </w:pPr>
+      <w:r>
+        <w:rPr>
+          <w:rFonts w:ascii="Arial" w:hAnsi="Arial" w:cs="Arial" w:eastAsia="Arial"/>
+          <w:sz w:val="24"/>
+        </w:rPr>
+        <w:t xml:space="preserve">Muchos docentes ya recurren a asistentes conversacionales (ChatGPT, Gemini) para aliviar la carga. La Encuesta Nacional sobre Usos y Percepciones sobre la Inteligencia Artificial Generativa en la Educación Superior Mexicana (ENIAG 2025), aplicada por la SEP a 163,259 docentes de 2,900 instituciones, revela que el 60% usa estas herramientas al menos una vez por semana y el 76% las empleó para crear textos en los últimos tres meses. Pero el dato decisivo es otro:</w:t>
+      </w:r>
+      <w:r>
+        <w:rPr>
+          <w:rFonts w:ascii="Arial" w:hAnsi="Arial" w:cs="Arial" w:eastAsia="Arial"/>
+          <w:sz w:val="24"/>
+        </w:rPr>
+        <w:t xml:space="preserve"> </w:t>
+      </w:r>
+      <w:r>
+        <w:rPr>
+          <w:rFonts w:ascii="Arial" w:hAnsi="Arial" w:cs="Arial" w:eastAsia="Arial"/>
+          <w:b/>
+          <w:bCs/>
+          <w:sz w:val="24"/>
+        </w:rPr>
+        <w:t xml:space="preserve">más del 75% de los docentes de instituciones públicas desconoce si su institución cuenta con lineamientos sobre el uso de inteligencia artificial</w:t>
+      </w:r>
+      <w:r>
+        <w:rPr>
+          <w:rFonts w:ascii="Arial" w:hAnsi="Arial" w:cs="Arial" w:eastAsia="Arial"/>
+          <w:sz w:val="24"/>
+        </w:rPr>
+        <w:t xml:space="preserve">, y más del 91% desea formarse en el tema.</w:t>
+      </w:r>
+    </w:p>
+    <w:p>
+      <w:pPr>
+        <w:pStyle w:val="BodyText"/>
+        <w:spacing w:line="360" w:lineRule="auto" w:before="0" w:after="0"/>
+        <w:jc w:val="both"/>
+      </w:pPr>
+      <w:r>
+        <w:rPr>
+          <w:rFonts w:ascii="Arial" w:hAnsi="Arial" w:cs="Arial" w:eastAsia="Arial"/>
+          <w:sz w:val="24"/>
+        </w:rPr>
+        <w:t xml:space="preserve">El problema no es, por tanto, introducir la inteligencia artificial en la práctica docente:</w:t>
+      </w:r>
+      <w:r>
+        <w:rPr>
+          <w:rFonts w:ascii="Arial" w:hAnsi="Arial" w:cs="Arial" w:eastAsia="Arial"/>
+          <w:sz w:val="24"/>
+        </w:rPr>
+        <w:t xml:space="preserve"> </w:t>
+      </w:r>
+      <w:r>
+        <w:rPr>
+          <w:rFonts w:ascii="Arial" w:hAnsi="Arial" w:cs="Arial" w:eastAsia="Arial"/>
+          <w:b/>
+          <w:bCs/>
+          <w:sz w:val="24"/>
+        </w:rPr>
+        <w:t xml:space="preserve">ya está adentro, y opera en un vacío normativo, formativo y curricular</w:t>
+      </w:r>
+      <w:r>
+        <w:rPr>
+          <w:rFonts w:ascii="Arial" w:hAnsi="Arial" w:cs="Arial" w:eastAsia="Arial"/>
+          <w:sz w:val="24"/>
+        </w:rPr>
+        <w:t xml:space="preserve">. El chat genérico desconoce las progresiones oficiales, el formato que exige la supervisión y —lo más importante— las características reales del grupo. La investigación lo confirma: las planeaciones generadas por IA superan a las de docentes noveles en claridad y alineación estructural, pero presentan limitaciones consistentes en profundidad de diferenciación y en alineación con principios de diseño inclusivo (Kaka &amp; Kessner, 2026).</w:t>
+      </w:r>
+    </w:p>
+    <w:p>
+      <w:pPr>
+        <w:pStyle w:val="BodyText"/>
+        <w:spacing w:line="360" w:lineRule="auto" w:before="0" w:after="0"/>
+        <w:jc w:val="both"/>
+      </w:pPr>
+      <w:r>
+        <w:rPr>
+          <w:rFonts w:ascii="Arial" w:hAnsi="Arial" w:cs="Arial" w:eastAsia="Arial"/>
+          <w:sz w:val="24"/>
+        </w:rPr>
+        <w:t xml:space="preserve">Cabe señalar que la ENIAG corresponde a educación superior.</w:t>
+      </w:r>
+      <w:r>
+        <w:rPr>
+          <w:rFonts w:ascii="Arial" w:hAnsi="Arial" w:cs="Arial" w:eastAsia="Arial"/>
+          <w:sz w:val="24"/>
+        </w:rPr>
+        <w:t xml:space="preserve"> </w:t>
+      </w:r>
+      <w:r>
+        <w:rPr>
+          <w:rFonts w:ascii="Arial" w:hAnsi="Arial" w:cs="Arial" w:eastAsia="Arial"/>
+          <w:b/>
+          <w:bCs/>
+          <w:sz w:val="24"/>
+        </w:rPr>
+        <w:t xml:space="preserve">No existe en México un diagnóstico nacional equivalente para la Educación Media Superior</w:t>
+      </w:r>
+      <w:r>
+        <w:rPr>
+          <w:rFonts w:ascii="Arial" w:hAnsi="Arial" w:cs="Arial" w:eastAsia="Arial"/>
+          <w:sz w:val="24"/>
+        </w:rPr>
+        <w:t xml:space="preserve">, el nivel que atiende a más de cinco millones de jóvenes. Esta práctica documenta, a escala de un plantel, aquello que a escala nacional aún no ha sido medido.</w:t>
+      </w:r>
+    </w:p>
+    <w:p>
+      <w:pPr>
+        <w:pStyle w:val="BodyText"/>
+        <w:spacing w:line="360" w:lineRule="auto" w:before="0" w:after="0"/>
+        <w:jc w:val="both"/>
+      </w:pPr>
+      <w:r>
+        <w:rPr>
+          <w:rFonts w:ascii="Arial" w:hAnsi="Arial" w:cs="Arial" w:eastAsia="Arial"/>
+          <w:b/>
+          <w:bCs/>
+          <w:sz w:val="24"/>
+        </w:rPr>
+        <w:t xml:space="preserve">Antecedentes internacionales.</w:t>
+      </w:r>
+      <w:r>
+        <w:rPr>
+          <w:rFonts w:ascii="Arial" w:hAnsi="Arial" w:cs="Arial" w:eastAsia="Arial"/>
+          <w:sz w:val="24"/>
+        </w:rPr>
+        <w:t xml:space="preserve"> </w:t>
+      </w:r>
+      <w:r>
+        <w:rPr>
+          <w:rFonts w:ascii="Arial" w:hAnsi="Arial" w:cs="Arial" w:eastAsia="Arial"/>
+          <w:sz w:val="24"/>
+        </w:rPr>
+        <w:t xml:space="preserve">Esta limitación ya se atiende en otras latitudes mediante sistemas que anclan la generación en el currículo oficial con arquitecturas de recuperación aumentada (RAG), que fundamentan las respuestas del modelo en documentos verificados y no en su conocimiento interno, reduciendo la fabricación de contenido. El caso más documentado es Shiksha Copilot (Varuvel Dennison et al., 2025), desplegado con 1,043 docentes de 757 escuelas en Karnataka, India, con curación humana previa a la entrega: reportó un ahorro de 2.02 horas semanales, reducción del estrés docente y solo un 2% de planeaciones inutilizables. Experiencias análogas en Vietnam y Ghana confirman la dirección: la planeación anclada en el currículo oficial y contextualizada al entorno supera a la genérica en relevancia cultural, exactitud y alineación curricular.</w:t>
+      </w:r>
+    </w:p>
+    <w:p>
+      <w:pPr>
+        <w:pStyle w:val="BodyText"/>
+        <w:spacing w:line="360" w:lineRule="auto" w:before="0" w:after="0"/>
+        <w:jc w:val="both"/>
+      </w:pPr>
+      <w:r>
+        <w:rPr>
+          <w:rFonts w:ascii="Arial" w:hAnsi="Arial" w:cs="Arial" w:eastAsia="Arial"/>
+          <w:sz w:val="24"/>
+        </w:rPr>
+        <w:t xml:space="preserve">Estos antecedentes validan la estrategia, pero comparten un límite que la presente práctica busca atender. Los docentes de Karnataka valoraron las referencias contextuales a nivel estatal</w:t>
+      </w:r>
+      <w:r>
+        <w:rPr>
+          <w:rFonts w:ascii="Arial" w:hAnsi="Arial" w:cs="Arial" w:eastAsia="Arial"/>
+          <w:sz w:val="24"/>
+        </w:rPr>
+        <w:t xml:space="preserve"> </w:t>
+      </w:r>
+      <w:r>
+        <w:rPr>
+          <w:rFonts w:ascii="Arial" w:hAnsi="Arial" w:cs="Arial" w:eastAsia="Arial"/>
+          <w:b/>
+          <w:bCs/>
+          <w:sz w:val="24"/>
+        </w:rPr>
+        <w:t xml:space="preserve">pero señalaron la ausencia de adaptación al grupo concreto</w:t>
+      </w:r>
+      <w:r>
+        <w:rPr>
+          <w:rFonts w:ascii="Arial" w:hAnsi="Arial" w:cs="Arial" w:eastAsia="Arial"/>
+          <w:sz w:val="24"/>
+        </w:rPr>
+        <w:t xml:space="preserve">, y hacían ajustes fuera de la plataforma para acomodar las competencias reales de sus estudiantes. La contextualización llegaba a la región, no al aula.</w:t>
+      </w:r>
+    </w:p>
+    <w:p>
+      <w:pPr>
+        <w:pStyle w:val="BodyText"/>
+        <w:spacing w:line="360" w:lineRule="auto" w:before="0" w:after="0"/>
+        <w:jc w:val="both"/>
+      </w:pPr>
+      <w:r>
+        <w:rPr>
+          <w:rFonts w:ascii="Arial" w:hAnsi="Arial" w:cs="Arial" w:eastAsia="Arial"/>
+          <w:sz w:val="24"/>
+        </w:rPr>
         <w:t xml:space="preserve">EduPlan MX nace en este contexto, desarrollada por un docente en servicio del Bachillerato General Oficial</w:t>
       </w:r>
       <w:r>
-        <w:t xml:space="preserve"> </w:t>
-      </w:r>
-      <w:r>
+        <w:rPr>
+          <w:rFonts w:ascii="Arial" w:hAnsi="Arial" w:cs="Arial" w:eastAsia="Arial"/>
+          <w:sz w:val="24"/>
+        </w:rPr>
+        <w:t xml:space="preserve"> </w:t>
+      </w:r>
+      <w:r>
+        <w:rPr>
+          <w:rFonts w:ascii="Arial" w:hAnsi="Arial" w:cs="Arial" w:eastAsia="Arial"/>
+          <w:sz w:val="24"/>
+        </w:rPr>
         <w:t xml:space="preserve">“Carlos Camacho Espíritu”</w:t>
       </w:r>
       <w:r>
-        <w:t xml:space="preserve"> </w:t>
-      </w:r>
-      <w:r>
+        <w:rPr>
+          <w:rFonts w:ascii="Arial" w:hAnsi="Arial" w:cs="Arial" w:eastAsia="Arial"/>
+          <w:sz w:val="24"/>
+        </w:rPr>
+        <w:t xml:space="preserve"> </w:t>
+      </w:r>
+      <w:r>
+        <w:rPr>
+          <w:rFonts w:ascii="Arial" w:hAnsi="Arial" w:cs="Arial" w:eastAsia="Arial"/>
+          <w:sz w:val="24"/>
+        </w:rPr>
         <w:t xml:space="preserve">(turno vespertino, Zona 013, Puebla), como una plataforma web gratuita que hoy utilizan los 7 docentes del plantel, de distintas asignaturas.</w:t>
       </w:r>
     </w:p>
@@ -248,34 +530,65 @@
     <w:p>
       <w:pPr>
         <w:pStyle w:val="Heading2"/>
-      </w:pPr>
-      <w:r>
+        <w:keepNext/>
+        <w:spacing w:line="360" w:lineRule="auto" w:before="80" w:after="40"/>
+      </w:pPr>
+      <w:r>
+        <w:rPr>
+          <w:rFonts w:ascii="Arial" w:hAnsi="Arial" w:cs="Arial" w:eastAsia="Arial"/>
+          <w:b/>
+          <w:sz w:val="24"/>
+        </w:rPr>
         <w:t xml:space="preserve">e. Propósito de la práctica innovadora</w:t>
       </w:r>
     </w:p>
     <w:p>
       <w:pPr>
         <w:pStyle w:val="FirstParagraph"/>
-      </w:pPr>
-      <w:r>
-        <w:t xml:space="preserve">Reducir drásticamente la carga administrativa de la planeación didáctica en el bachillerato mediante una plataforma web con inteligencia artificial que genera planeaciones alineadas al MCCEMS a partir de las progresiones oficiales de la DGB — para que el tiempo recuperado se reinvierta en lo pedagógico: contextualizar la enseñanza a partir del diagnóstico socioeducativo real del grupo, y no en llenar formatos.</w:t>
+        <w:spacing w:line="360" w:lineRule="auto" w:before="0" w:after="0"/>
+        <w:jc w:val="both"/>
+      </w:pPr>
+      <w:r>
+        <w:rPr>
+          <w:rFonts w:ascii="Arial" w:hAnsi="Arial" w:cs="Arial" w:eastAsia="Arial"/>
+          <w:sz w:val="24"/>
+        </w:rPr>
+        <w:t xml:space="preserve">Reducir drásticamente la carga administrativa de la planeación en el bachillerato mediante una plataforma web con inteligencia artificial que genera planeaciones alineadas al MCCEMS a partir de las progresiones oficiales de la DGB, para que el tiempo recuperado se reinvierta en lo pedagógico: contextualizar la enseñanza desde el diagnóstico socioeducativo real del grupo, y no en llenar formatos.</w:t>
       </w:r>
     </w:p>
     <w:p>
       <w:pPr>
         <w:pStyle w:val="BodyText"/>
-      </w:pPr>
-      <w:r>
-        <w:t xml:space="preserve">La apuesta central no es que</w:t>
-      </w:r>
-      <w:r>
-        <w:t xml:space="preserve"> </w:t>
-      </w:r>
-      <w:r>
+        <w:spacing w:line="360" w:lineRule="auto" w:before="0" w:after="0"/>
+        <w:jc w:val="both"/>
+      </w:pPr>
+      <w:r>
+        <w:rPr>
+          <w:rFonts w:ascii="Arial" w:hAnsi="Arial" w:cs="Arial" w:eastAsia="Arial"/>
+          <w:sz w:val="24"/>
+        </w:rPr>
+        <w:t xml:space="preserve">La apuesta no es que</w:t>
+      </w:r>
+      <w:r>
+        <w:rPr>
+          <w:rFonts w:ascii="Arial" w:hAnsi="Arial" w:cs="Arial" w:eastAsia="Arial"/>
+          <w:sz w:val="24"/>
+        </w:rPr>
+        <w:t xml:space="preserve"> </w:t>
+      </w:r>
+      <w:r>
+        <w:rPr>
+          <w:rFonts w:ascii="Arial" w:hAnsi="Arial" w:cs="Arial" w:eastAsia="Arial"/>
+          <w:sz w:val="24"/>
+        </w:rPr>
         <w:t xml:space="preserve">“la IA planee por el docente”</w:t>
       </w:r>
       <w:r>
-        <w:t xml:space="preserve">, sino invertir la ecuación del uso docente de la IA: en lugar de que cada profesor negocie con un chat genérico, la plataforma incorpora el criterio pedagógico (currículo oficial, formato de supervisión, diagnóstico del grupo, metodologías activas) y deja al docente las decisiones que sí son suyas: qué enseñar, con qué estrategia, para qué grupo y con qué adaptaciones.</w:t>
+        <w:rPr>
+          <w:rFonts w:ascii="Arial" w:hAnsi="Arial" w:cs="Arial" w:eastAsia="Arial"/>
+          <w:sz w:val="24"/>
+        </w:rPr>
+        <w:t xml:space="preserve">, sino invertir la ecuación: en lugar de que cada profesor negocie con un chat genérico, la plataforma incorpora el criterio pedagógico (currículo oficial, formato de supervisión, diagnóstico del grupo, metodologías activas) y deja al docente las decisiones que sí son suyas: qué enseñar, con qué estrategia, para qué grupo y con qué adaptaciones.</w:t>
       </w:r>
     </w:p>
     <w:bookmarkEnd w:id="13"/>
@@ -283,19 +596,30 @@
     <w:p>
       <w:pPr>
         <w:pStyle w:val="Heading2"/>
-      </w:pPr>
-      <w:r>
+        <w:keepNext/>
+        <w:spacing w:line="360" w:lineRule="auto" w:before="80" w:after="40"/>
+      </w:pPr>
+      <w:r>
+        <w:rPr>
+          <w:rFonts w:ascii="Arial" w:hAnsi="Arial" w:cs="Arial" w:eastAsia="Arial"/>
+          <w:b/>
+          <w:sz w:val="24"/>
+        </w:rPr>
         <w:t xml:space="preserve">f. Fines de aprendizaje o competencias que busca desarrollar</w:t>
       </w:r>
     </w:p>
     <w:p>
       <w:pPr>
         <w:pStyle w:val="FirstParagraph"/>
-      </w:pPr>
-      <w:r>
-        <w:rPr>
+        <w:spacing w:line="360" w:lineRule="auto" w:before="0" w:after="0"/>
+        <w:jc w:val="both"/>
+      </w:pPr>
+      <w:r>
+        <w:rPr>
+          <w:rFonts w:ascii="Arial" w:hAnsi="Arial" w:cs="Arial" w:eastAsia="Arial"/>
           <w:b/>
           <w:bCs/>
+          <w:sz w:val="24"/>
         </w:rPr>
         <w:t xml:space="preserve">En el profesorado (destinatario directo de la práctica):</w:t>
       </w:r>
@@ -307,8 +631,14 @@
           <w:ilvl w:val="0"/>
           <w:numId w:val="1001"/>
         </w:numPr>
-      </w:pPr>
-      <w:r>
+        <w:spacing w:line="360" w:lineRule="auto" w:before="0" w:after="0"/>
+        <w:jc w:val="both"/>
+      </w:pPr>
+      <w:r>
+        <w:rPr>
+          <w:rFonts w:ascii="Arial" w:hAnsi="Arial" w:cs="Arial" w:eastAsia="Arial"/>
+          <w:sz w:val="24"/>
+        </w:rPr>
         <w:t xml:space="preserve">Alfabetización digital y en inteligencia artificial con sentido crítico: comprender qué puede y qué no puede delegarse a un sistema de IA en el diseño didáctico (el docente conserva la selección curricular, la estrategia y la validación; la IA redacta y estructura).</w:t>
       </w:r>
     </w:p>
@@ -319,8 +649,14 @@
           <w:ilvl w:val="0"/>
           <w:numId w:val="1001"/>
         </w:numPr>
-      </w:pPr>
-      <w:r>
+        <w:spacing w:line="360" w:lineRule="auto" w:before="0" w:after="0"/>
+        <w:jc w:val="both"/>
+      </w:pPr>
+      <w:r>
+        <w:rPr>
+          <w:rFonts w:ascii="Arial" w:hAnsi="Arial" w:cs="Arial" w:eastAsia="Arial"/>
+          <w:sz w:val="24"/>
+        </w:rPr>
         <w:t xml:space="preserve">Apropiación del MCCEMS: al planear sobre las progresiones oficiales textuales, el docente se familiariza con el nuevo marco curricular en el uso, no en cursos abstractos.</w:t>
       </w:r>
     </w:p>
@@ -331,19 +667,29 @@
           <w:ilvl w:val="0"/>
           <w:numId w:val="1001"/>
         </w:numPr>
-      </w:pPr>
-      <w:r>
+        <w:spacing w:line="360" w:lineRule="auto" w:before="0" w:after="0"/>
+        <w:jc w:val="both"/>
+      </w:pPr>
+      <w:r>
+        <w:rPr>
+          <w:rFonts w:ascii="Arial" w:hAnsi="Arial" w:cs="Arial" w:eastAsia="Arial"/>
+          <w:sz w:val="24"/>
+        </w:rPr>
         <w:t xml:space="preserve">Planeación contextualizada: capacidad de traducir datos socioeducativos del grupo (conectividad, situación laboral, intereses) en decisiones didácticas explícitas.</w:t>
       </w:r>
     </w:p>
     <w:p>
       <w:pPr>
         <w:pStyle w:val="FirstParagraph"/>
-      </w:pPr>
-      <w:r>
-        <w:rPr>
+        <w:spacing w:line="360" w:lineRule="auto" w:before="0" w:after="0"/>
+        <w:jc w:val="both"/>
+      </w:pPr>
+      <w:r>
+        <w:rPr>
+          <w:rFonts w:ascii="Arial" w:hAnsi="Arial" w:cs="Arial" w:eastAsia="Arial"/>
           <w:b/>
           <w:bCs/>
+          <w:sz w:val="24"/>
         </w:rPr>
         <w:t xml:space="preserve">En el estudiantado (destinatario indirecto):</w:t>
       </w:r>
@@ -355,17 +701,35 @@
           <w:ilvl w:val="0"/>
           <w:numId w:val="1002"/>
         </w:numPr>
-      </w:pPr>
-      <w:r>
+        <w:spacing w:line="360" w:lineRule="auto" w:before="0" w:after="0"/>
+        <w:jc w:val="both"/>
+      </w:pPr>
+      <w:r>
+        <w:rPr>
+          <w:rFonts w:ascii="Arial" w:hAnsi="Arial" w:cs="Arial" w:eastAsia="Arial"/>
+          <w:sz w:val="24"/>
+        </w:rPr>
         <w:t xml:space="preserve">Experiencias de aprendizaje más pertinentes: cada planeación generada incluye al menos una actividad adaptada explícitamente a las características del grupo (etiquetada como</w:t>
       </w:r>
       <w:r>
-        <w:t xml:space="preserve"> </w:t>
-      </w:r>
-      <w:r>
+        <w:rPr>
+          <w:rFonts w:ascii="Arial" w:hAnsi="Arial" w:cs="Arial" w:eastAsia="Arial"/>
+          <w:sz w:val="24"/>
+        </w:rPr>
+        <w:t xml:space="preserve"> </w:t>
+      </w:r>
+      <w:r>
+        <w:rPr>
+          <w:rFonts w:ascii="Arial" w:hAnsi="Arial" w:cs="Arial" w:eastAsia="Arial"/>
+          <w:sz w:val="24"/>
+        </w:rPr>
         <w:t xml:space="preserve">“Adaptación al grupo”</w:t>
       </w:r>
       <w:r>
+        <w:rPr>
+          <w:rFonts w:ascii="Arial" w:hAnsi="Arial" w:cs="Arial" w:eastAsia="Arial"/>
+          <w:sz w:val="24"/>
+        </w:rPr>
         <w:t xml:space="preserve">), por ejemplo, evitar tareas dependientes de internet cuando el diagnóstico indica conectividad limitada.</w:t>
       </w:r>
     </w:p>
@@ -376,237 +740,363 @@
           <w:ilvl w:val="0"/>
           <w:numId w:val="1002"/>
         </w:numPr>
-      </w:pPr>
-      <w:r>
+        <w:spacing w:line="360" w:lineRule="auto" w:before="0" w:after="0"/>
+        <w:jc w:val="both"/>
+      </w:pPr>
+      <w:r>
+        <w:rPr>
+          <w:rFonts w:ascii="Arial" w:hAnsi="Arial" w:cs="Arial" w:eastAsia="Arial"/>
+          <w:sz w:val="24"/>
+        </w:rPr>
         <w:t xml:space="preserve">Vinculación comunitaria: las planeaciones integran la problemática PAEC del plantel, conectando los contenidos con el entorno real de las y los estudiantes.</w:t>
       </w:r>
     </w:p>
     <w:bookmarkEnd w:id="14"/>
-    <w:bookmarkStart w:id="15" w:name="X10c4929634f0510a1e0a006194b7086dec71848"/>
+    <w:bookmarkStart w:id="20" w:name="X10c4929634f0510a1e0a006194b7086dec71848"/>
     <w:p>
       <w:pPr>
         <w:pStyle w:val="Heading2"/>
-      </w:pPr>
-      <w:r>
+        <w:keepNext/>
+        <w:spacing w:line="360" w:lineRule="auto" w:before="80" w:after="40"/>
+      </w:pPr>
+      <w:r>
+        <w:rPr>
+          <w:rFonts w:ascii="Arial" w:hAnsi="Arial" w:cs="Arial" w:eastAsia="Arial"/>
+          <w:b/>
+          <w:sz w:val="24"/>
+        </w:rPr>
         <w:t xml:space="preserve">g. Metodología: secuencia de actividades, recursos y materiales</w:t>
       </w:r>
     </w:p>
+    <w:bookmarkStart w:id="15" w:name="enfoque-y-diseño"/>
+    <w:p>
+      <w:pPr>
+        <w:pStyle w:val="Heading3"/>
+        <w:keepNext/>
+        <w:spacing w:line="360" w:lineRule="auto" w:before="80" w:after="40"/>
+      </w:pPr>
+      <w:r>
+        <w:rPr>
+          <w:rFonts w:ascii="Arial" w:hAnsi="Arial" w:cs="Arial" w:eastAsia="Arial"/>
+          <w:b/>
+          <w:sz w:val="24"/>
+        </w:rPr>
+        <w:t xml:space="preserve">Enfoque y diseño</w:t>
+      </w:r>
+    </w:p>
     <w:p>
       <w:pPr>
         <w:pStyle w:val="FirstParagraph"/>
-      </w:pPr>
-      <w:r>
-        <w:rPr>
+        <w:spacing w:line="360" w:lineRule="auto" w:before="0" w:after="0"/>
+        <w:jc w:val="both"/>
+      </w:pPr>
+      <w:r>
+        <w:rPr>
+          <w:rFonts w:ascii="Arial" w:hAnsi="Arial" w:cs="Arial" w:eastAsia="Arial"/>
+          <w:sz w:val="24"/>
+        </w:rPr>
+        <w:t xml:space="preserve">La práctica se documenta bajo un enfoque de</w:t>
+      </w:r>
+      <w:r>
+        <w:rPr>
+          <w:rFonts w:ascii="Arial" w:hAnsi="Arial" w:cs="Arial" w:eastAsia="Arial"/>
+          <w:sz w:val="24"/>
+        </w:rPr>
+        <w:t xml:space="preserve"> </w:t>
+      </w:r>
+      <w:r>
+        <w:rPr>
+          <w:rFonts w:ascii="Arial" w:hAnsi="Arial" w:cs="Arial" w:eastAsia="Arial"/>
           <w:b/>
           <w:bCs/>
-        </w:rPr>
-        <w:t xml:space="preserve">La práctica se desarrolló en cuatro fases:</w:t>
-      </w:r>
-    </w:p>
-    <w:p>
-      <w:pPr>
-        <w:pStyle w:val="BodyText"/>
-      </w:pPr>
-      <w:r>
-        <w:rPr>
-          <w:b/>
-          <w:bCs/>
-        </w:rPr>
-        <w:t xml:space="preserve">Fase 1 — Diagnóstico del problema (ciclo 2025-2026).</w:t>
-      </w:r>
-      <w:r>
-        <w:t xml:space="preserve"> </w:t>
-      </w:r>
-      <w:r>
-        <w:t xml:space="preserve">Registro del tiempo real de planeación de los docentes del plantel (40-50 minutos por planeación en Word) y de las fricciones: búsqueda de progresiones en PDFs, recaptura de datos del formato, desconexión entre el diagnóstico socioeducativo (que se aplicaba y se archivaba) y la planeación.</w:t>
-      </w:r>
-    </w:p>
-    <w:p>
-      <w:pPr>
-        <w:pStyle w:val="BodyText"/>
-      </w:pPr>
-      <w:r>
-        <w:rPr>
-          <w:b/>
-          <w:bCs/>
-        </w:rPr>
-        <w:t xml:space="preserve">Fase 2 — Construcción de la plataforma.</w:t>
-      </w:r>
-      <w:r>
-        <w:t xml:space="preserve"> </w:t>
-      </w:r>
-      <w:r>
-        <w:t xml:space="preserve">Desarrollo web (React + Firebase, con el modelo Gemini de Google como motor de generación) bajo tres principios de diseño: (1) costo cero para el docente y la escuela — infraestructura en niveles gratuitos y cada docente usa su propia clave de API gratuita; (2) currículo oficial primero — se construyó un pipeline de extracción que procesó más de 100 programas oficiales de la DGB (generaciones 2023-2026 y 2025-2028) para que el selector de contenidos ofrezca las progresiones textuales, distinguiendo el plan de estudios de cada generación; (3) honestidad curricular — cuando un programa aún no está verificado contra el documento oficial, la plataforma lo advierte en lugar de inventar contenido.</w:t>
-      </w:r>
-    </w:p>
-    <w:p>
-      <w:pPr>
-        <w:pStyle w:val="BodyText"/>
-      </w:pPr>
-      <w:r>
-        <w:rPr>
-          <w:b/>
-          <w:bCs/>
-        </w:rPr>
-        <w:t xml:space="preserve">Fase 3 — El flujo docente (secuencia de uso, 4 pasos).</w:t>
-      </w:r>
-      <w:r>
-        <w:t xml:space="preserve"> </w:t>
-      </w:r>
-      <w:r>
-        <w:t xml:space="preserve">1.</w:t>
-      </w:r>
-      <w:r>
-        <w:t xml:space="preserve"> </w:t>
-      </w:r>
-      <w:r>
-        <w:rPr>
+          <w:sz w:val="24"/>
+        </w:rPr>
+        <w:t xml:space="preserve">investigación basada en diseño</w:t>
+      </w:r>
+      <w:r>
+        <w:rPr>
+          <w:rFonts w:ascii="Arial" w:hAnsi="Arial" w:cs="Arial" w:eastAsia="Arial"/>
+          <w:sz w:val="24"/>
+        </w:rPr>
+        <w:t xml:space="preserve"> </w:t>
+      </w:r>
+      <w:r>
+        <w:rPr>
+          <w:rFonts w:ascii="Arial" w:hAnsi="Arial" w:cs="Arial" w:eastAsia="Arial"/>
+          <w:sz w:val="24"/>
+        </w:rPr>
+        <w:t xml:space="preserve">(</w:t>
+      </w:r>
+      <w:r>
+        <w:rPr>
+          <w:rFonts w:ascii="Arial" w:hAnsi="Arial" w:cs="Arial" w:eastAsia="Arial"/>
           <w:i/>
           <w:iCs/>
-        </w:rPr>
-        <w:t xml:space="preserve">Contexto escolar:</w:t>
-      </w:r>
-      <w:r>
-        <w:t xml:space="preserve"> </w:t>
-      </w:r>
-      <w:r>
-        <w:t xml:space="preserve">el docente configura una sola vez los datos del plantel (visión, municipio, CCT).</w:t>
-      </w:r>
-      <w:r>
-        <w:t xml:space="preserve"> </w:t>
-      </w:r>
-      <w:r>
-        <w:t xml:space="preserve">2.</w:t>
-      </w:r>
-      <w:r>
-        <w:t xml:space="preserve"> </w:t>
-      </w:r>
-      <w:r>
-        <w:rPr>
-          <w:i/>
-          <w:iCs/>
-        </w:rPr>
-        <w:t xml:space="preserve">Diagnóstico del grupo:</w:t>
-      </w:r>
-      <w:r>
-        <w:t xml:space="preserve"> </w:t>
-      </w:r>
-      <w:r>
-        <w:t xml:space="preserve">el docente aplica su cuestionario socioeducativo (Google Forms); la plataforma le proporciona un</w:t>
-      </w:r>
-      <w:r>
-        <w:t xml:space="preserve"> </w:t>
-      </w:r>
-      <w:r>
-        <w:t xml:space="preserve">“machote”</w:t>
-      </w:r>
-      <w:r>
-        <w:t xml:space="preserve"> </w:t>
-      </w:r>
-      <w:r>
-        <w:t xml:space="preserve">— un prompt estructurado — para que cualquier asistente de IA resuma las respuestas en un perfil grupal sin datos personales (porcentajes y patrones, nunca nombres); ese resumen se guarda y alimenta todas sus planeaciones.</w:t>
-      </w:r>
-      <w:r>
-        <w:t xml:space="preserve"> </w:t>
-      </w:r>
-      <w:r>
-        <w:t xml:space="preserve">3.</w:t>
-      </w:r>
-      <w:r>
-        <w:t xml:space="preserve"> </w:t>
-      </w:r>
-      <w:r>
-        <w:rPr>
-          <w:i/>
-          <w:iCs/>
-        </w:rPr>
-        <w:t xml:space="preserve">Generación:</w:t>
-      </w:r>
-      <w:r>
-        <w:t xml:space="preserve"> </w:t>
-      </w:r>
-      <w:r>
-        <w:t xml:space="preserve">el docente selecciona la progresión oficial (o escribe su tema), el tipo de apoyo pedagógico que necesita ese día (estructurar, diferenciar con DUA, visualizar, evaluar, gamificar o contextualizar), la metodología activa (ABP, aula invertida, estudio de casos…), sesiones y evaluación. La IA genera en 20-40 segundos una planeación completa: secuencia didáctica por sesión, instrumentos de evaluación, estudio independiente, vinculación PAEC y la adaptación explícita al grupo.</w:t>
-      </w:r>
-      <w:r>
-        <w:t xml:space="preserve"> </w:t>
-      </w:r>
-      <w:r>
-        <w:t xml:space="preserve">4.</w:t>
-      </w:r>
-      <w:r>
-        <w:t xml:space="preserve"> </w:t>
-      </w:r>
-      <w:r>
-        <w:rPr>
-          <w:i/>
-          <w:iCs/>
-        </w:rPr>
-        <w:t xml:space="preserve">Validación e impresión:</w:t>
-      </w:r>
-      <w:r>
-        <w:t xml:space="preserve"> </w:t>
-      </w:r>
-      <w:r>
-        <w:t xml:space="preserve">un auditor pedagógico integrado revisa la alineación; el docente ajusta, guarda e imprime el documento con el formato que exige la supervisión.</w:t>
+          <w:sz w:val="24"/>
+        </w:rPr>
+        <w:t xml:space="preserve">design-based research</w:t>
+      </w:r>
+      <w:r>
+        <w:rPr>
+          <w:rFonts w:ascii="Arial" w:hAnsi="Arial" w:cs="Arial" w:eastAsia="Arial"/>
+          <w:sz w:val="24"/>
+        </w:rPr>
+        <w:t xml:space="preserve">), pertinente cuando la intervención y su estudio se construyen iterativamente en el contexto real de aplicación y no en condiciones de laboratorio. Corresponde a un</w:t>
+      </w:r>
+      <w:r>
+        <w:rPr>
+          <w:rFonts w:ascii="Arial" w:hAnsi="Arial" w:cs="Arial" w:eastAsia="Arial"/>
+          <w:sz w:val="24"/>
+        </w:rPr>
+        <w:t xml:space="preserve"> </w:t>
+      </w:r>
+      <w:r>
+        <w:rPr>
+          <w:rFonts w:ascii="Arial" w:hAnsi="Arial" w:cs="Arial" w:eastAsia="Arial"/>
+          <w:b/>
+          <w:bCs/>
+          <w:sz w:val="24"/>
+        </w:rPr>
+        <w:t xml:space="preserve">estudio de caso instrumental</w:t>
+      </w:r>
+      <w:r>
+        <w:rPr>
+          <w:rFonts w:ascii="Arial" w:hAnsi="Arial" w:cs="Arial" w:eastAsia="Arial"/>
+          <w:sz w:val="24"/>
+        </w:rPr>
+        <w:t xml:space="preserve">: el interés no reside en el plantel en sí, sino en lo que permite comprender sobre la contextualización curricular asistida por IA en la Educación Media Superior. El ciclo siguió cuatro iteraciones —diagnóstico, construcción, uso y ajuste—, con la retroalimentación docente incorporada directamente a la plataforma en producción.</w:t>
+      </w:r>
+    </w:p>
+    <w:bookmarkEnd w:id="15"/>
+    <w:bookmarkStart w:id="16" w:name="participantes"/>
+    <w:p>
+      <w:pPr>
+        <w:pStyle w:val="Heading3"/>
+        <w:keepNext/>
+        <w:spacing w:line="360" w:lineRule="auto" w:before="80" w:after="40"/>
+      </w:pPr>
+      <w:r>
+        <w:rPr>
+          <w:rFonts w:ascii="Arial" w:hAnsi="Arial" w:cs="Arial" w:eastAsia="Arial"/>
+          <w:b/>
+          <w:sz w:val="24"/>
+        </w:rPr>
+        <w:t xml:space="preserve">Participantes</w:t>
+      </w:r>
+    </w:p>
+    <w:p>
+      <w:pPr>
+        <w:pStyle w:val="FirstParagraph"/>
+        <w:spacing w:line="360" w:lineRule="auto" w:before="0" w:after="0"/>
+        <w:jc w:val="both"/>
+      </w:pPr>
+      <w:r>
+        <w:rPr>
+          <w:rFonts w:ascii="Arial" w:hAnsi="Arial" w:cs="Arial" w:eastAsia="Arial"/>
+          <w:sz w:val="24"/>
+        </w:rPr>
+        <w:t xml:space="preserve">Siete docentes en servicio del Bachillerato General Oficial</w:t>
+      </w:r>
+      <w:r>
+        <w:rPr>
+          <w:rFonts w:ascii="Arial" w:hAnsi="Arial" w:cs="Arial" w:eastAsia="Arial"/>
+          <w:sz w:val="24"/>
+        </w:rPr>
+        <w:t xml:space="preserve"> </w:t>
+      </w:r>
+      <w:r>
+        <w:rPr>
+          <w:rFonts w:ascii="Arial" w:hAnsi="Arial" w:cs="Arial" w:eastAsia="Arial"/>
+          <w:sz w:val="24"/>
+        </w:rPr>
+        <w:t xml:space="preserve">“Carlos Camacho Espíritu”</w:t>
+      </w:r>
+      <w:r>
+        <w:rPr>
+          <w:rFonts w:ascii="Arial" w:hAnsi="Arial" w:cs="Arial" w:eastAsia="Arial"/>
+          <w:sz w:val="24"/>
+        </w:rPr>
+        <w:t xml:space="preserve">, turno vespertino, Zona Escolar 013, Puebla, con participación voluntaria y sin requerimiento administrativo.</w:t>
       </w:r>
     </w:p>
     <w:p>
       <w:pPr>
         <w:pStyle w:val="BodyText"/>
-      </w:pPr>
-      <w:r>
-        <w:rPr>
+        <w:spacing w:line="360" w:lineRule="auto" w:before="0" w:after="0"/>
+        <w:jc w:val="both"/>
+      </w:pPr>
+      <w:r>
+        <w:rPr>
+          <w:rFonts w:ascii="Arial" w:hAnsi="Arial" w:cs="Arial" w:eastAsia="Arial"/>
+          <w:sz w:val="24"/>
+        </w:rPr>
+        <w:t xml:space="preserve">El grupo cubre las distintas asignaturas del plan de estudios de los Bachilleratos Generales Oficiales, por lo que la plataforma fue probada frente a progresiones de áreas diversas del MCCEMS. La antigüedad abarca de tres a más de veinte años de servicio, lo que permitió contrastarla con docentes formados bajo marcos curriculares previos y con otros de incorporación reciente. Esta heterogeneidad es informativa: la reducción de tiempo no proviene únicamente de profesorado joven y familiarizado con herramientas digitales. No se documentó sistemáticamente su experiencia previa con inteligencia artificial, lo que se consigna entre las limitaciones.</w:t>
+      </w:r>
+    </w:p>
+    <w:bookmarkEnd w:id="16"/>
+    <w:bookmarkStart w:id="17" w:name="instrumentos-y-recolección-de-datos"/>
+    <w:p>
+      <w:pPr>
+        <w:pStyle w:val="Heading3"/>
+        <w:keepNext/>
+        <w:spacing w:line="360" w:lineRule="auto" w:before="80" w:after="40"/>
+      </w:pPr>
+      <w:r>
+        <w:rPr>
+          <w:rFonts w:ascii="Arial" w:hAnsi="Arial" w:cs="Arial" w:eastAsia="Arial"/>
+          <w:b/>
+          <w:sz w:val="24"/>
+        </w:rPr>
+        <w:t xml:space="preserve">Instrumentos y recolección de datos</w:t>
+      </w:r>
+    </w:p>
+    <w:p>
+      <w:pPr>
+        <w:pStyle w:val="FirstParagraph"/>
+        <w:spacing w:line="360" w:lineRule="auto" w:before="0" w:after="0"/>
+        <w:jc w:val="both"/>
+      </w:pPr>
+      <w:r>
+        <w:rPr>
+          <w:rFonts w:ascii="Arial" w:hAnsi="Arial" w:cs="Arial" w:eastAsia="Arial"/>
+          <w:sz w:val="24"/>
+        </w:rPr>
+        <w:t xml:space="preserve">La recolección de información se apoyó en tres fuentes:</w:t>
+      </w:r>
+    </w:p>
+    <w:p>
+      <w:pPr>
+        <w:pStyle w:val="BodyText"/>
+        <w:spacing w:line="360" w:lineRule="auto" w:before="0" w:after="0"/>
+        <w:jc w:val="both"/>
+      </w:pPr>
+      <w:r>
+        <w:rPr>
+          <w:rFonts w:ascii="Arial" w:hAnsi="Arial" w:cs="Arial" w:eastAsia="Arial"/>
           <w:b/>
           <w:bCs/>
-        </w:rPr>
-        <w:t xml:space="preserve">Fase 4 — Adopción acompañada.</w:t>
-      </w:r>
-      <w:r>
-        <w:t xml:space="preserve"> </w:t>
-      </w:r>
-      <w:r>
-        <w:t xml:space="preserve">Incorporación de los 7 docentes del plantel con acompañamiento entre pares; la fricción detectada (registro, claves de API, navegación) se corrigió iterativamente sobre la plataforma en producción.</w:t>
+          <w:sz w:val="24"/>
+        </w:rPr>
+        <w:t xml:space="preserve">1. Autorreporte docente sobre el tiempo de elaboración.</w:t>
+      </w:r>
+      <w:r>
+        <w:rPr>
+          <w:rFonts w:ascii="Arial" w:hAnsi="Arial" w:cs="Arial" w:eastAsia="Arial"/>
+          <w:sz w:val="24"/>
+        </w:rPr>
+        <w:t xml:space="preserve"> </w:t>
+      </w:r>
+      <w:r>
+        <w:rPr>
+          <w:rFonts w:ascii="Arial" w:hAnsi="Arial" w:cs="Arial" w:eastAsia="Arial"/>
+          <w:sz w:val="24"/>
+        </w:rPr>
+        <w:t xml:space="preserve">El tiempo para completar una planeación —en el procedimiento previo, en procesador de texto, y con la plataforma— fue estimado por los propios participantes. De aquí proviene el resultado central del apartado h. Es una estimación subjetiva: el autorreporte tiende a sobreestimar las tareas percibidas como gravosas. Registra el cambio tal como el profesorado lo experimenta —la dimensión que incide en el bienestar documentado por TALIS 2024— y establece una línea base contrastable.</w:t>
       </w:r>
     </w:p>
     <w:p>
       <w:pPr>
         <w:pStyle w:val="BodyText"/>
-      </w:pPr>
-      <w:r>
-        <w:rPr>
+        <w:spacing w:line="360" w:lineRule="auto" w:before="0" w:after="0"/>
+        <w:jc w:val="both"/>
+      </w:pPr>
+      <w:r>
+        <w:rPr>
+          <w:rFonts w:ascii="Arial" w:hAnsi="Arial" w:cs="Arial" w:eastAsia="Arial"/>
           <w:b/>
           <w:bCs/>
-        </w:rPr>
-        <w:t xml:space="preserve">Recursos y materiales:</w:t>
-      </w:r>
-      <w:r>
-        <w:t xml:space="preserve"> </w:t>
-      </w:r>
-      <w:r>
-        <w:t xml:space="preserve">plataforma web EduPlan MX (acceso desde navegador, computadora o celular); cuenta gratuita de Google por docente; cuestionario socioeducativo del plantel; programas de estudio oficiales de la DGB (integrados en la plataforma). Costo de operación: $0.</w:t>
-      </w:r>
-    </w:p>
-    <w:bookmarkEnd w:id="15"/>
-    <w:bookmarkStart w:id="16" w:name="h.-resultados"/>
-    <w:p>
-      <w:pPr>
-        <w:pStyle w:val="Heading2"/>
-      </w:pPr>
-      <w:r>
-        <w:t xml:space="preserve">h. Resultados</w:t>
+          <w:sz w:val="24"/>
+        </w:rPr>
+        <w:t xml:space="preserve">2. Analítica de uso de la plataforma.</w:t>
+      </w:r>
+      <w:r>
+        <w:rPr>
+          <w:rFonts w:ascii="Arial" w:hAnsi="Arial" w:cs="Arial" w:eastAsia="Arial"/>
+          <w:sz w:val="24"/>
+        </w:rPr>
+        <w:t xml:space="preserve"> </w:t>
+      </w:r>
+      <w:r>
+        <w:rPr>
+          <w:rFonts w:ascii="Arial" w:hAnsi="Arial" w:cs="Arial" w:eastAsia="Arial"/>
+          <w:sz w:val="24"/>
+        </w:rPr>
+        <w:t xml:space="preserve">Registro anónimo de planeaciones generadas e impresas, que permitirá contrastar el tiempo autorreportado con el intervalo efectivo entre generación e impresión.</w:t>
+      </w:r>
+    </w:p>
+    <w:p>
+      <w:pPr>
+        <w:pStyle w:val="BodyText"/>
+        <w:spacing w:line="360" w:lineRule="auto" w:before="0" w:after="0"/>
+        <w:jc w:val="both"/>
+      </w:pPr>
+      <w:r>
+        <w:rPr>
+          <w:rFonts w:ascii="Arial" w:hAnsi="Arial" w:cs="Arial" w:eastAsia="Arial"/>
+          <w:b/>
+          <w:bCs/>
+          <w:sz w:val="24"/>
+        </w:rPr>
+        <w:t xml:space="preserve">3. Valoración cualitativa.</w:t>
+      </w:r>
+      <w:r>
+        <w:rPr>
+          <w:rFonts w:ascii="Arial" w:hAnsi="Arial" w:cs="Arial" w:eastAsia="Arial"/>
+          <w:sz w:val="24"/>
+        </w:rPr>
+        <w:t xml:space="preserve"> </w:t>
+      </w:r>
+      <w:r>
+        <w:rPr>
+          <w:rFonts w:ascii="Arial" w:hAnsi="Arial" w:cs="Arial" w:eastAsia="Arial"/>
+          <w:sz w:val="24"/>
+        </w:rPr>
+        <w:t xml:space="preserve">Conversación con los docentes durante el acompañamiento entre pares y registro de las fricciones de uso que motivaron ajustes sucesivos.</w:t>
+      </w:r>
+    </w:p>
+    <w:p>
+      <w:pPr>
+        <w:pStyle w:val="BodyText"/>
+        <w:spacing w:line="360" w:lineRule="auto" w:before="0" w:after="0"/>
+        <w:jc w:val="both"/>
+      </w:pPr>
+      <w:r>
+        <w:rPr>
+          <w:rFonts w:ascii="Arial" w:hAnsi="Arial" w:cs="Arial" w:eastAsia="Arial"/>
+          <w:sz w:val="24"/>
+        </w:rPr>
+        <w:t xml:space="preserve">La reducción de tiempo no se sustenta, por ahora, en medición cronometrada ni en comparación con un grupo de control.</w:t>
+      </w:r>
+    </w:p>
+    <w:bookmarkEnd w:id="17"/>
+    <w:bookmarkStart w:id="18" w:name="consideraciones-éticas"/>
+    <w:p>
+      <w:pPr>
+        <w:pStyle w:val="Heading3"/>
+        <w:keepNext/>
+        <w:spacing w:line="360" w:lineRule="auto" w:before="80" w:after="40"/>
+      </w:pPr>
+      <w:r>
+        <w:rPr>
+          <w:rFonts w:ascii="Arial" w:hAnsi="Arial" w:cs="Arial" w:eastAsia="Arial"/>
+          <w:b/>
+          <w:sz w:val="24"/>
+        </w:rPr>
+        <w:t xml:space="preserve">Consideraciones éticas</w:t>
       </w:r>
     </w:p>
     <w:p>
       <w:pPr>
         <w:pStyle w:val="FirstParagraph"/>
-      </w:pPr>
-      <w:r>
-        <w:rPr>
-          <w:b/>
-          <w:bCs/>
-        </w:rPr>
-        <w:t xml:space="preserve">Resultados preliminares con los 7 docentes del plantel (ciclo 2025-2026):</w:t>
+        <w:spacing w:line="360" w:lineRule="auto" w:before="0" w:after="0"/>
+        <w:jc w:val="both"/>
+      </w:pPr>
+      <w:r>
+        <w:rPr>
+          <w:rFonts w:ascii="Arial" w:hAnsi="Arial" w:cs="Arial" w:eastAsia="Arial"/>
+          <w:sz w:val="24"/>
+        </w:rPr>
+        <w:t xml:space="preserve">El tratamiento de la información se rige por tres decisiones explícitas de diseño:</w:t>
       </w:r>
     </w:p>
     <w:p>
@@ -616,22 +1106,31 @@
           <w:ilvl w:val="0"/>
           <w:numId w:val="1003"/>
         </w:numPr>
-      </w:pPr>
-      <w:r>
-        <w:t xml:space="preserve">El tiempo de elaboración de una planeación didáctica completa pasó de</w:t>
-      </w:r>
-      <w:r>
-        <w:t xml:space="preserve"> </w:t>
-      </w:r>
-      <w:r>
-        <w:rPr>
+        <w:spacing w:line="360" w:lineRule="auto" w:before="0" w:after="0"/>
+        <w:jc w:val="both"/>
+      </w:pPr>
+      <w:r>
+        <w:rPr>
+          <w:rFonts w:ascii="Arial" w:hAnsi="Arial" w:cs="Arial" w:eastAsia="Arial"/>
           <w:b/>
           <w:bCs/>
-        </w:rPr>
-        <w:t xml:space="preserve">40-50 minutos a aproximadamente 5 minutos</w:t>
-      </w:r>
-      <w:r>
-        <w:t xml:space="preserve">, manteniendo el formato exigido por la supervisión escolar.</w:t>
+          <w:sz w:val="24"/>
+        </w:rPr>
+        <w:t xml:space="preserve">Ningún dato personal de estudiantes ingresa al sistema.</w:t>
+      </w:r>
+      <w:r>
+        <w:rPr>
+          <w:rFonts w:ascii="Arial" w:hAnsi="Arial" w:cs="Arial" w:eastAsia="Arial"/>
+          <w:sz w:val="24"/>
+        </w:rPr>
+        <w:t xml:space="preserve"> </w:t>
+      </w:r>
+      <w:r>
+        <w:rPr>
+          <w:rFonts w:ascii="Arial" w:hAnsi="Arial" w:cs="Arial" w:eastAsia="Arial"/>
+          <w:sz w:val="24"/>
+        </w:rPr>
+        <w:t xml:space="preserve">El diagnóstico socioeducativo se convierte en un perfil grupal agregado —porcentajes y patrones— antes de tocar la plataforma; nunca se registran nombres ni respuestas individuales.</w:t>
       </w:r>
     </w:p>
     <w:p>
@@ -641,19 +1140,31 @@
           <w:ilvl w:val="0"/>
           <w:numId w:val="1003"/>
         </w:numPr>
-      </w:pPr>
-      <w:r>
-        <w:rPr>
+        <w:spacing w:line="360" w:lineRule="auto" w:before="0" w:after="0"/>
+        <w:jc w:val="both"/>
+      </w:pPr>
+      <w:r>
+        <w:rPr>
+          <w:rFonts w:ascii="Arial" w:hAnsi="Arial" w:cs="Arial" w:eastAsia="Arial"/>
           <w:b/>
           <w:bCs/>
-        </w:rPr>
-        <w:t xml:space="preserve">Retención voluntaria del 100%:</w:t>
-      </w:r>
-      <w:r>
-        <w:t xml:space="preserve"> </w:t>
-      </w:r>
-      <w:r>
-        <w:t xml:space="preserve">los 7 docentes que probaron la plataforma regresaron a usarla sin requerimiento administrativo, y la valoración cualitativa destaca la calidad del documento entregable.</w:t>
+          <w:sz w:val="24"/>
+        </w:rPr>
+        <w:t xml:space="preserve">La analítica de uso es anónima</w:t>
+      </w:r>
+      <w:r>
+        <w:rPr>
+          <w:rFonts w:ascii="Arial" w:hAnsi="Arial" w:cs="Arial" w:eastAsia="Arial"/>
+          <w:sz w:val="24"/>
+        </w:rPr>
+        <w:t xml:space="preserve"> </w:t>
+      </w:r>
+      <w:r>
+        <w:rPr>
+          <w:rFonts w:ascii="Arial" w:hAnsi="Arial" w:cs="Arial" w:eastAsia="Arial"/>
+          <w:sz w:val="24"/>
+        </w:rPr>
+        <w:t xml:space="preserve">y no vincula planeaciones con docentes identificables.</w:t>
       </w:r>
     </w:p>
     <w:p>
@@ -663,170 +1174,461 @@
           <w:ilvl w:val="0"/>
           <w:numId w:val="1003"/>
         </w:numPr>
-      </w:pPr>
-      <w:r>
-        <w:t xml:space="preserve">Las planeaciones incorporan ahora progresiones oficiales textuales del MCCEMS (76 unidades de aprendizaje curricular con contenido oficial verificado integradas a la plataforma), reduciendo el riesgo de desalineación curricular entre planes de estudio 2023-2026 y 2025-2028.</w:t>
-      </w:r>
-    </w:p>
-    <w:p>
-      <w:pPr>
-        <w:pStyle w:val="Compact"/>
-        <w:numPr>
-          <w:ilvl w:val="0"/>
-          <w:numId w:val="1003"/>
-        </w:numPr>
-      </w:pPr>
-      <w:r>
-        <w:t xml:space="preserve">El diagnóstico socioeducativo dejó de ser un trámite archivado: alimenta directamente la generación de cada planeación con adaptaciones explícitas y verificables en el documento.</w:t>
+        <w:spacing w:line="360" w:lineRule="auto" w:before="0" w:after="0"/>
+        <w:jc w:val="both"/>
+      </w:pPr>
+      <w:r>
+        <w:rPr>
+          <w:rFonts w:ascii="Arial" w:hAnsi="Arial" w:cs="Arial" w:eastAsia="Arial"/>
+          <w:b/>
+          <w:bCs/>
+          <w:sz w:val="24"/>
+        </w:rPr>
+        <w:t xml:space="preserve">Participación voluntaria e informada:</w:t>
+      </w:r>
+      <w:r>
+        <w:rPr>
+          <w:rFonts w:ascii="Arial" w:hAnsi="Arial" w:cs="Arial" w:eastAsia="Arial"/>
+          <w:sz w:val="24"/>
+        </w:rPr>
+        <w:t xml:space="preserve"> </w:t>
+      </w:r>
+      <w:r>
+        <w:rPr>
+          <w:rFonts w:ascii="Arial" w:hAnsi="Arial" w:cs="Arial" w:eastAsia="Arial"/>
+          <w:sz w:val="24"/>
+        </w:rPr>
+        <w:t xml:space="preserve">los siete docentes conocieron el propósito de documentar la experiencia y participaron sin obligación institucional.</w:t>
       </w:r>
     </w:p>
     <w:p>
       <w:pPr>
         <w:pStyle w:val="FirstParagraph"/>
-      </w:pPr>
-      <w:r>
-        <w:rPr>
+        <w:spacing w:line="360" w:lineRule="auto" w:before="0" w:after="0"/>
+        <w:jc w:val="both"/>
+      </w:pPr>
+      <w:r>
+        <w:rPr>
+          <w:rFonts w:ascii="Arial" w:hAnsi="Arial" w:cs="Arial" w:eastAsia="Arial"/>
+          <w:sz w:val="24"/>
+        </w:rPr>
+        <w:t xml:space="preserve">Se declara asimismo que el autor de esta ponencia es a la vez el desarrollador de la plataforma y el observador de su uso. Esta doble condición —inherente a la investigación basada en diseño— se explicita como un factor a considerar en la interpretación de los resultados, y motiva el diseño de la evaluación externa descrita en el apartado h.</w:t>
+      </w:r>
+    </w:p>
+    <w:bookmarkEnd w:id="18"/>
+    <w:bookmarkStart w:id="19" w:name="secuencia-de-actividades"/>
+    <w:p>
+      <w:pPr>
+        <w:pStyle w:val="Heading3"/>
+        <w:keepNext/>
+        <w:spacing w:line="360" w:lineRule="auto" w:before="80" w:after="40"/>
+      </w:pPr>
+      <w:r>
+        <w:rPr>
+          <w:rFonts w:ascii="Arial" w:hAnsi="Arial" w:cs="Arial" w:eastAsia="Arial"/>
+          <w:b/>
+          <w:sz w:val="24"/>
+        </w:rPr>
+        <w:t xml:space="preserve">Secuencia de actividades</w:t>
+      </w:r>
+    </w:p>
+    <w:p>
+      <w:pPr>
+        <w:pStyle w:val="FirstParagraph"/>
+        <w:spacing w:line="360" w:lineRule="auto" w:before="0" w:after="0"/>
+        <w:jc w:val="both"/>
+      </w:pPr>
+      <w:r>
+        <w:rPr>
+          <w:rFonts w:ascii="Arial" w:hAnsi="Arial" w:cs="Arial" w:eastAsia="Arial"/>
           <w:b/>
           <w:bCs/>
-        </w:rPr>
-        <w:t xml:space="preserve">Medición en curso:</w:t>
-      </w:r>
-      <w:r>
-        <w:t xml:space="preserve"> </w:t>
-      </w:r>
-      <w:r>
-        <w:t xml:space="preserve">la plataforma incorpora analítica de uso anónima (planeaciones generadas e impresas, tiempos reales de elaboración) y está en diseño un piloto formal de 6 semanas con pre/post-encuesta y evaluación ciega de calidad de planeaciones mediante rúbrica de doble juez, cuyos resultados se compartirían en la presentación. [Ajusta este párrafo según el avance que tengas en agosto.]</w:t>
-      </w:r>
-    </w:p>
-    <w:bookmarkEnd w:id="16"/>
-    <w:bookmarkStart w:id="17" w:name="i.-reflexión-sobre-la-práctica"/>
+          <w:sz w:val="24"/>
+        </w:rPr>
+        <w:t xml:space="preserve">La práctica se desarrolló en cuatro fases:</w:t>
+      </w:r>
+    </w:p>
+    <w:p>
+      <w:pPr>
+        <w:pStyle w:val="BodyText"/>
+        <w:spacing w:line="360" w:lineRule="auto" w:before="0" w:after="0"/>
+        <w:jc w:val="both"/>
+      </w:pPr>
+      <w:r>
+        <w:rPr>
+          <w:rFonts w:ascii="Arial" w:hAnsi="Arial" w:cs="Arial" w:eastAsia="Arial"/>
+          <w:b/>
+          <w:bCs/>
+          <w:sz w:val="24"/>
+        </w:rPr>
+        <w:t xml:space="preserve">Fase 1 — Diagnóstico del problema (ciclo 2025-2026).</w:t>
+      </w:r>
+      <w:r>
+        <w:rPr>
+          <w:rFonts w:ascii="Arial" w:hAnsi="Arial" w:cs="Arial" w:eastAsia="Arial"/>
+          <w:sz w:val="24"/>
+        </w:rPr>
+        <w:t xml:space="preserve"> </w:t>
+      </w:r>
+      <w:r>
+        <w:rPr>
+          <w:rFonts w:ascii="Arial" w:hAnsi="Arial" w:cs="Arial" w:eastAsia="Arial"/>
+          <w:sz w:val="24"/>
+        </w:rPr>
+        <w:t xml:space="preserve">Registro del tiempo real de planeación de los docentes del plantel (40-50 minutos por planeación en Word) y de las fricciones: búsqueda de progresiones en PDFs, recaptura de datos del formato, desconexión entre el diagnóstico socioeducativo (que se aplicaba y se archivaba) y la planeación.</w:t>
+      </w:r>
+    </w:p>
+    <w:p>
+      <w:pPr>
+        <w:pStyle w:val="BodyText"/>
+        <w:spacing w:line="360" w:lineRule="auto" w:before="0" w:after="0"/>
+        <w:jc w:val="both"/>
+      </w:pPr>
+      <w:r>
+        <w:rPr>
+          <w:rFonts w:ascii="Arial" w:hAnsi="Arial" w:cs="Arial" w:eastAsia="Arial"/>
+          <w:b/>
+          <w:bCs/>
+          <w:sz w:val="24"/>
+        </w:rPr>
+        <w:t xml:space="preserve">Fase 2 — Construcción de la plataforma.</w:t>
+      </w:r>
+      <w:r>
+        <w:rPr>
+          <w:rFonts w:ascii="Arial" w:hAnsi="Arial" w:cs="Arial" w:eastAsia="Arial"/>
+          <w:sz w:val="24"/>
+        </w:rPr>
+        <w:t xml:space="preserve"> </w:t>
+      </w:r>
+      <w:r>
+        <w:rPr>
+          <w:rFonts w:ascii="Arial" w:hAnsi="Arial" w:cs="Arial" w:eastAsia="Arial"/>
+          <w:sz w:val="24"/>
+        </w:rPr>
+        <w:t xml:space="preserve">Desarrollo web (React + Firebase, con Gemini como motor de generación) bajo tres principios: (1) costo cero — infraestructura en niveles gratuitos y clave de API gratuita por docente; (2) currículo oficial primero — un proceso de extracción procesó más de 100 programas oficiales de la DGB (generaciones 2023-2026 y 2025-2028) para que el selector ofrezca las progresiones textuales de cada plan; (3) honestidad curricular — cuando un programa no está verificado contra el documento oficial, la plataforma lo advierte en lugar de inventar contenido.</w:t>
+      </w:r>
+    </w:p>
+    <w:p>
+      <w:pPr>
+        <w:pStyle w:val="BodyText"/>
+        <w:spacing w:line="360" w:lineRule="auto" w:before="0" w:after="0"/>
+        <w:jc w:val="both"/>
+      </w:pPr>
+      <w:r>
+        <w:rPr>
+          <w:rFonts w:ascii="Arial" w:hAnsi="Arial" w:cs="Arial" w:eastAsia="Arial"/>
+          <w:sz w:val="24"/>
+        </w:rPr>
+        <w:t xml:space="preserve">El mecanismo de anclaje merece precisión: el texto literal de la progresión seleccionada, junto con el perfil del grupo y el contexto del plantel, se incorpora a la instrucción que recibe el modelo, de modo que la generación se produce</w:t>
+      </w:r>
+      <w:r>
+        <w:rPr>
+          <w:rFonts w:ascii="Arial" w:hAnsi="Arial" w:cs="Arial" w:eastAsia="Arial"/>
+          <w:sz w:val="24"/>
+        </w:rPr>
+        <w:t xml:space="preserve"> </w:t>
+      </w:r>
+      <w:r>
+        <w:rPr>
+          <w:rFonts w:ascii="Arial" w:hAnsi="Arial" w:cs="Arial" w:eastAsia="Arial"/>
+          <w:b/>
+          <w:bCs/>
+          <w:sz w:val="24"/>
+        </w:rPr>
+        <w:t xml:space="preserve">sobre el documento curricular y no sobre el conocimiento interno del sistema</w:t>
+      </w:r>
+      <w:r>
+        <w:rPr>
+          <w:rFonts w:ascii="Arial" w:hAnsi="Arial" w:cs="Arial" w:eastAsia="Arial"/>
+          <w:sz w:val="24"/>
+        </w:rPr>
+        <w:t xml:space="preserve">. Es un anclaje por inyección de contexto: más simple que las arquitecturas de recuperación aumentada con búsqueda vectorial, persigue el mismo propósito y resulta viable con la infraestructura gratuita de una escuela pública.</w:t>
+      </w:r>
+    </w:p>
+    <w:p>
+      <w:pPr>
+        <w:pStyle w:val="BodyText"/>
+        <w:spacing w:line="360" w:lineRule="auto" w:before="0" w:after="0"/>
+        <w:jc w:val="both"/>
+      </w:pPr>
+      <w:r>
+        <w:rPr>
+          <w:rFonts w:ascii="Arial" w:hAnsi="Arial" w:cs="Arial" w:eastAsia="Arial"/>
+          <w:b/>
+          <w:bCs/>
+          <w:sz w:val="24"/>
+        </w:rPr>
+        <w:t xml:space="preserve">Fase 3 — El flujo docente (4 pasos).</w:t>
+      </w:r>
+      <w:r>
+        <w:rPr>
+          <w:rFonts w:ascii="Arial" w:hAnsi="Arial" w:cs="Arial" w:eastAsia="Arial"/>
+          <w:sz w:val="24"/>
+        </w:rPr>
+        <w:t xml:space="preserve"> </w:t>
+      </w:r>
+      <w:r>
+        <w:rPr>
+          <w:rFonts w:ascii="Arial" w:hAnsi="Arial" w:cs="Arial" w:eastAsia="Arial"/>
+          <w:sz w:val="24"/>
+        </w:rPr>
+        <w:t xml:space="preserve">1.</w:t>
+      </w:r>
+      <w:r>
+        <w:rPr>
+          <w:rFonts w:ascii="Arial" w:hAnsi="Arial" w:cs="Arial" w:eastAsia="Arial"/>
+          <w:sz w:val="24"/>
+        </w:rPr>
+        <w:t xml:space="preserve"> </w:t>
+      </w:r>
+      <w:r>
+        <w:rPr>
+          <w:rFonts w:ascii="Arial" w:hAnsi="Arial" w:cs="Arial" w:eastAsia="Arial"/>
+          <w:i/>
+          <w:iCs/>
+          <w:sz w:val="24"/>
+        </w:rPr>
+        <w:t xml:space="preserve">Contexto escolar:</w:t>
+      </w:r>
+      <w:r>
+        <w:rPr>
+          <w:rFonts w:ascii="Arial" w:hAnsi="Arial" w:cs="Arial" w:eastAsia="Arial"/>
+          <w:sz w:val="24"/>
+        </w:rPr>
+        <w:t xml:space="preserve"> </w:t>
+      </w:r>
+      <w:r>
+        <w:rPr>
+          <w:rFonts w:ascii="Arial" w:hAnsi="Arial" w:cs="Arial" w:eastAsia="Arial"/>
+          <w:sz w:val="24"/>
+        </w:rPr>
+        <w:t xml:space="preserve">se configuran una sola vez los datos del plantel (visión, municipio, CCT).</w:t>
+      </w:r>
+      <w:r>
+        <w:rPr>
+          <w:rFonts w:ascii="Arial" w:hAnsi="Arial" w:cs="Arial" w:eastAsia="Arial"/>
+          <w:sz w:val="24"/>
+        </w:rPr>
+        <w:t xml:space="preserve"> </w:t>
+      </w:r>
+      <w:r>
+        <w:rPr>
+          <w:rFonts w:ascii="Arial" w:hAnsi="Arial" w:cs="Arial" w:eastAsia="Arial"/>
+          <w:sz w:val="24"/>
+        </w:rPr>
+        <w:t xml:space="preserve">2.</w:t>
+      </w:r>
+      <w:r>
+        <w:rPr>
+          <w:rFonts w:ascii="Arial" w:hAnsi="Arial" w:cs="Arial" w:eastAsia="Arial"/>
+          <w:sz w:val="24"/>
+        </w:rPr>
+        <w:t xml:space="preserve"> </w:t>
+      </w:r>
+      <w:r>
+        <w:rPr>
+          <w:rFonts w:ascii="Arial" w:hAnsi="Arial" w:cs="Arial" w:eastAsia="Arial"/>
+          <w:i/>
+          <w:iCs/>
+          <w:sz w:val="24"/>
+        </w:rPr>
+        <w:t xml:space="preserve">Diagnóstico del grupo:</w:t>
+      </w:r>
+      <w:r>
+        <w:rPr>
+          <w:rFonts w:ascii="Arial" w:hAnsi="Arial" w:cs="Arial" w:eastAsia="Arial"/>
+          <w:sz w:val="24"/>
+        </w:rPr>
+        <w:t xml:space="preserve"> </w:t>
+      </w:r>
+      <w:r>
+        <w:rPr>
+          <w:rFonts w:ascii="Arial" w:hAnsi="Arial" w:cs="Arial" w:eastAsia="Arial"/>
+          <w:sz w:val="24"/>
+        </w:rPr>
+        <w:t xml:space="preserve">el docente aplica su cuestionario socioeducativo; la plataforma le proporciona un prompt estructurado para que cualquier asistente de IA resuma las respuestas en un perfil grupal sin datos personales (porcentajes y patrones, nunca nombres), que se guarda y alimenta todas sus planeaciones.</w:t>
+      </w:r>
+      <w:r>
+        <w:rPr>
+          <w:rFonts w:ascii="Arial" w:hAnsi="Arial" w:cs="Arial" w:eastAsia="Arial"/>
+          <w:sz w:val="24"/>
+        </w:rPr>
+        <w:t xml:space="preserve"> </w:t>
+      </w:r>
+      <w:r>
+        <w:rPr>
+          <w:rFonts w:ascii="Arial" w:hAnsi="Arial" w:cs="Arial" w:eastAsia="Arial"/>
+          <w:sz w:val="24"/>
+        </w:rPr>
+        <w:t xml:space="preserve">3.</w:t>
+      </w:r>
+      <w:r>
+        <w:rPr>
+          <w:rFonts w:ascii="Arial" w:hAnsi="Arial" w:cs="Arial" w:eastAsia="Arial"/>
+          <w:sz w:val="24"/>
+        </w:rPr>
+        <w:t xml:space="preserve"> </w:t>
+      </w:r>
+      <w:r>
+        <w:rPr>
+          <w:rFonts w:ascii="Arial" w:hAnsi="Arial" w:cs="Arial" w:eastAsia="Arial"/>
+          <w:i/>
+          <w:iCs/>
+          <w:sz w:val="24"/>
+        </w:rPr>
+        <w:t xml:space="preserve">Generación:</w:t>
+      </w:r>
+      <w:r>
+        <w:rPr>
+          <w:rFonts w:ascii="Arial" w:hAnsi="Arial" w:cs="Arial" w:eastAsia="Arial"/>
+          <w:sz w:val="24"/>
+        </w:rPr>
+        <w:t xml:space="preserve"> </w:t>
+      </w:r>
+      <w:r>
+        <w:rPr>
+          <w:rFonts w:ascii="Arial" w:hAnsi="Arial" w:cs="Arial" w:eastAsia="Arial"/>
+          <w:sz w:val="24"/>
+        </w:rPr>
+        <w:t xml:space="preserve">el docente selecciona la progresión oficial (o su tema), el apoyo pedagógico que requiere ese día (estructurar, diferenciar con DUA, visualizar, evaluar, gamificar o contextualizar), la metodología activa (ABP, aula invertida, estudio de casos…), sesiones y evaluación. La IA genera en 20-40 segundos la planeación completa: secuencia por sesión, instrumentos de evaluación, estudio independiente, vinculación PAEC y adaptación explícita al grupo.</w:t>
+      </w:r>
+      <w:r>
+        <w:rPr>
+          <w:rFonts w:ascii="Arial" w:hAnsi="Arial" w:cs="Arial" w:eastAsia="Arial"/>
+          <w:sz w:val="24"/>
+        </w:rPr>
+        <w:t xml:space="preserve"> </w:t>
+      </w:r>
+      <w:r>
+        <w:rPr>
+          <w:rFonts w:ascii="Arial" w:hAnsi="Arial" w:cs="Arial" w:eastAsia="Arial"/>
+          <w:sz w:val="24"/>
+        </w:rPr>
+        <w:t xml:space="preserve">4.</w:t>
+      </w:r>
+      <w:r>
+        <w:rPr>
+          <w:rFonts w:ascii="Arial" w:hAnsi="Arial" w:cs="Arial" w:eastAsia="Arial"/>
+          <w:sz w:val="24"/>
+        </w:rPr>
+        <w:t xml:space="preserve"> </w:t>
+      </w:r>
+      <w:r>
+        <w:rPr>
+          <w:rFonts w:ascii="Arial" w:hAnsi="Arial" w:cs="Arial" w:eastAsia="Arial"/>
+          <w:i/>
+          <w:iCs/>
+          <w:sz w:val="24"/>
+        </w:rPr>
+        <w:t xml:space="preserve">Validación e impresión:</w:t>
+      </w:r>
+      <w:r>
+        <w:rPr>
+          <w:rFonts w:ascii="Arial" w:hAnsi="Arial" w:cs="Arial" w:eastAsia="Arial"/>
+          <w:sz w:val="24"/>
+        </w:rPr>
+        <w:t xml:space="preserve"> </w:t>
+      </w:r>
+      <w:r>
+        <w:rPr>
+          <w:rFonts w:ascii="Arial" w:hAnsi="Arial" w:cs="Arial" w:eastAsia="Arial"/>
+          <w:sz w:val="24"/>
+        </w:rPr>
+        <w:t xml:space="preserve">un auditor pedagógico integrado revisa la alineación; el docente ajusta, guarda e imprime con el formato que exige la supervisión.</w:t>
+      </w:r>
+    </w:p>
+    <w:p>
+      <w:pPr>
+        <w:pStyle w:val="BodyText"/>
+        <w:spacing w:line="360" w:lineRule="auto" w:before="0" w:after="0"/>
+        <w:jc w:val="both"/>
+      </w:pPr>
+      <w:r>
+        <w:rPr>
+          <w:rFonts w:ascii="Arial" w:hAnsi="Arial" w:cs="Arial" w:eastAsia="Arial"/>
+          <w:b/>
+          <w:bCs/>
+          <w:sz w:val="24"/>
+        </w:rPr>
+        <w:t xml:space="preserve">Fase 4 — Adopción acompañada.</w:t>
+      </w:r>
+      <w:r>
+        <w:rPr>
+          <w:rFonts w:ascii="Arial" w:hAnsi="Arial" w:cs="Arial" w:eastAsia="Arial"/>
+          <w:sz w:val="24"/>
+        </w:rPr>
+        <w:t xml:space="preserve"> </w:t>
+      </w:r>
+      <w:r>
+        <w:rPr>
+          <w:rFonts w:ascii="Arial" w:hAnsi="Arial" w:cs="Arial" w:eastAsia="Arial"/>
+          <w:sz w:val="24"/>
+        </w:rPr>
+        <w:t xml:space="preserve">Incorporación de los 7 docentes con acompañamiento entre pares; la fricción detectada (registro, claves de API, navegación) se corrigió iterativamente sobre la plataforma en producción.</w:t>
+      </w:r>
+    </w:p>
+    <w:p>
+      <w:pPr>
+        <w:pStyle w:val="BodyText"/>
+        <w:spacing w:line="360" w:lineRule="auto" w:before="0" w:after="0"/>
+        <w:jc w:val="both"/>
+      </w:pPr>
+      <w:r>
+        <w:rPr>
+          <w:rFonts w:ascii="Arial" w:hAnsi="Arial" w:cs="Arial" w:eastAsia="Arial"/>
+          <w:b/>
+          <w:bCs/>
+          <w:sz w:val="24"/>
+        </w:rPr>
+        <w:t xml:space="preserve">Recursos y materiales:</w:t>
+      </w:r>
+      <w:r>
+        <w:rPr>
+          <w:rFonts w:ascii="Arial" w:hAnsi="Arial" w:cs="Arial" w:eastAsia="Arial"/>
+          <w:sz w:val="24"/>
+        </w:rPr>
+        <w:t xml:space="preserve"> </w:t>
+      </w:r>
+      <w:r>
+        <w:rPr>
+          <w:rFonts w:ascii="Arial" w:hAnsi="Arial" w:cs="Arial" w:eastAsia="Arial"/>
+          <w:sz w:val="24"/>
+        </w:rPr>
+        <w:t xml:space="preserve">plataforma web EduPlan MX (acceso desde navegador, computadora o celular); cuenta gratuita de Google por docente; cuestionario socioeducativo del plantel; programas de estudio oficiales de la DGB (integrados en la plataforma). Costo de operación: $0.</w:t>
+      </w:r>
+    </w:p>
+    <w:bookmarkEnd w:id="19"/>
+    <w:bookmarkEnd w:id="20"/>
+    <w:bookmarkStart w:id="21" w:name="h.-resultados"/>
     <w:p>
       <w:pPr>
         <w:pStyle w:val="Heading2"/>
-      </w:pPr>
-      <w:r>
-        <w:t xml:space="preserve">i. Reflexión sobre la práctica</w:t>
+        <w:keepNext/>
+        <w:spacing w:line="360" w:lineRule="auto" w:before="80" w:after="40"/>
+      </w:pPr>
+      <w:r>
+        <w:rPr>
+          <w:rFonts w:ascii="Arial" w:hAnsi="Arial" w:cs="Arial" w:eastAsia="Arial"/>
+          <w:b/>
+          <w:sz w:val="24"/>
+        </w:rPr>
+        <w:t xml:space="preserve">h. Resultados</w:t>
       </w:r>
     </w:p>
     <w:p>
       <w:pPr>
         <w:pStyle w:val="FirstParagraph"/>
-      </w:pPr>
-      <w:r>
-        <w:t xml:space="preserve">La experiencia deja tres aprendizajes que considero transferibles a otros contextos educativos:</w:t>
-      </w:r>
-    </w:p>
-    <w:p>
-      <w:pPr>
-        <w:pStyle w:val="BodyText"/>
-      </w:pPr>
-      <w:r>
-        <w:rPr>
+        <w:spacing w:line="360" w:lineRule="auto" w:before="0" w:after="0"/>
+        <w:jc w:val="both"/>
+      </w:pPr>
+      <w:r>
+        <w:rPr>
+          <w:rFonts w:ascii="Arial" w:hAnsi="Arial" w:cs="Arial" w:eastAsia="Arial"/>
           <w:b/>
           <w:bCs/>
-        </w:rPr>
-        <w:t xml:space="preserve">1. La innovación con IA en educación no es un problema de tecnología sino de criterio pedagógico incorporado.</w:t>
-      </w:r>
-      <w:r>
-        <w:t xml:space="preserve"> </w:t>
-      </w:r>
-      <w:r>
-        <w:t xml:space="preserve">La diferencia entre un chat genérico y EduPlan MX no está en el modelo de lenguaje (es el mismo tipo de tecnología), sino en dónde reside el conocimiento pedagógico: el currículo oficial, el formato de la supervisión, el diagnóstico del grupo y las metodologías activas están integrados en el sistema, de modo que el docente no necesita ser experto en</w:t>
-      </w:r>
-      <w:r>
-        <w:t xml:space="preserve"> </w:t>
-      </w:r>
-      <w:r>
-        <w:t xml:space="preserve">“prompts”</w:t>
-      </w:r>
-      <w:r>
-        <w:t xml:space="preserve"> </w:t>
-      </w:r>
-      <w:r>
-        <w:t xml:space="preserve">para obtener un resultado situado. Democratizar la IA para el profesorado significa exactamente esto: que el costo de entrada no sea la ingeniería de instrucciones.</w:t>
-      </w:r>
-    </w:p>
-    <w:p>
-      <w:pPr>
-        <w:pStyle w:val="BodyText"/>
-      </w:pPr>
-      <w:r>
-        <w:rPr>
-          <w:b/>
-          <w:bCs/>
-        </w:rPr>
-        <w:t xml:space="preserve">2. Reducir carga administrativa es una intervención pedagógica, no solo de gestión.</w:t>
-      </w:r>
-      <w:r>
-        <w:t xml:space="preserve"> </w:t>
-      </w:r>
-      <w:r>
-        <w:t xml:space="preserve">Los 45 minutos recuperados por planeación no desaparecen: se convierten en tiempo disponible para retroalimentar estudiantes, diseñar materiales y — de manera visible en esta práctica — para mirar los datos del diagnóstico grupal que antes nadie tenía tiempo de leer. La condición de posibilidad de la enseñanza contextualizada es el tiempo docente.</w:t>
-      </w:r>
-    </w:p>
-    <w:p>
-      <w:pPr>
-        <w:pStyle w:val="BodyText"/>
-      </w:pPr>
-      <w:r>
-        <w:rPr>
-          <w:b/>
-          <w:bCs/>
-        </w:rPr>
-        <w:t xml:space="preserve">3. La honestidad del sistema es una postura ética frente a la IA generativa.</w:t>
-      </w:r>
-      <w:r>
-        <w:t xml:space="preserve"> </w:t>
-      </w:r>
-      <w:r>
-        <w:t xml:space="preserve">Durante el desarrollo se detectó que la IA podía</w:t>
-      </w:r>
-      <w:r>
-        <w:t xml:space="preserve"> </w:t>
-      </w:r>
-      <w:r>
-        <w:t xml:space="preserve">“rellenar”</w:t>
-      </w:r>
-      <w:r>
-        <w:t xml:space="preserve"> </w:t>
-      </w:r>
-      <w:r>
-        <w:t xml:space="preserve">progresiones inexistentes con texto verosímil. La decisión de diseño fue advertir explícitamente al docente cuando un programa no está verificado contra el documento oficial, en lugar de simular certeza. En tiempos de desinformación, enseñar (y diseñar) con IA exige sistemas que sepan decir</w:t>
-      </w:r>
-      <w:r>
-        <w:t xml:space="preserve"> </w:t>
-      </w:r>
-      <w:r>
-        <w:t xml:space="preserve">“esto no lo sé”</w:t>
-      </w:r>
-      <w:r>
-        <w:t xml:space="preserve">.</w:t>
-      </w:r>
-    </w:p>
-    <w:p>
-      <w:pPr>
-        <w:pStyle w:val="BodyText"/>
-      </w:pPr>
-      <w:r>
-        <w:t xml:space="preserve">Queda abierta una tensión que la práctica no resuelve del todo: el riesgo de que la facilidad de generación produzca planeaciones que se entregan sin apropiación. Las decisiones de diseño (selección activa de progresión, estrategia y necesidad pedagógica; auditor integrado; adaptación al grupo visible) buscan mantener al docente como autor y no como espectador, pero la evaluación de este punto requiere el piloto formal en curso.</w:t>
-      </w:r>
-    </w:p>
-    <w:bookmarkEnd w:id="17"/>
-    <w:bookmarkStart w:id="18" w:name="j.-referencias-formato-apa-7ª-ed."/>
-    <w:p>
-      <w:pPr>
-        <w:pStyle w:val="Heading2"/>
-      </w:pPr>
-      <w:r>
-        <w:t xml:space="preserve">j. Referencias (formato APA 7ª ed.)</w:t>
-      </w:r>
-    </w:p>
-    <w:p>
-      <w:pPr>
-        <w:pStyle w:val="FirstParagraph"/>
-      </w:pPr>
-      <w:r>
-        <w:t xml:space="preserve">[Completa/ajusta las que uses realmente en el texto final. Sugerencias:]</w:t>
+          <w:sz w:val="24"/>
+        </w:rPr>
+        <w:t xml:space="preserve">Resultados preliminares con los 7 docentes del plantel (ciclo 2025-2026):</w:t>
       </w:r>
     </w:p>
     <w:p>
@@ -836,22 +1638,38 @@
           <w:ilvl w:val="0"/>
           <w:numId w:val="1004"/>
         </w:numPr>
-      </w:pPr>
-      <w:r>
-        <w:t xml:space="preserve">Dirección General del Bachillerato. (2025).</w:t>
-      </w:r>
-      <w:r>
-        <w:t xml:space="preserve"> </w:t>
-      </w:r>
-      <w:r>
-        <w:rPr>
-          <w:i/>
-          <w:iCs/>
-        </w:rPr>
-        <w:t xml:space="preserve">Programas de estudio para la generación 2025-2028 y subsecuentes (MCCEMS)</w:t>
-      </w:r>
-      <w:r>
-        <w:t xml:space="preserve">. Secretaría de Educación Pública. https://dgb.sep.gob.mx/programas-de-estudio</w:t>
+        <w:spacing w:line="360" w:lineRule="auto" w:before="0" w:after="0"/>
+        <w:jc w:val="both"/>
+      </w:pPr>
+      <w:r>
+        <w:rPr>
+          <w:rFonts w:ascii="Arial" w:hAnsi="Arial" w:cs="Arial" w:eastAsia="Arial"/>
+          <w:sz w:val="24"/>
+        </w:rPr>
+        <w:t xml:space="preserve">El tiempo de elaboración de una planeación didáctica completa pasó,</w:t>
+      </w:r>
+      <w:r>
+        <w:rPr>
+          <w:rFonts w:ascii="Arial" w:hAnsi="Arial" w:cs="Arial" w:eastAsia="Arial"/>
+          <w:sz w:val="24"/>
+        </w:rPr>
+        <w:t xml:space="preserve"> </w:t>
+      </w:r>
+      <w:r>
+        <w:rPr>
+          <w:rFonts w:ascii="Arial" w:hAnsi="Arial" w:cs="Arial" w:eastAsia="Arial"/>
+          <w:b/>
+          <w:bCs/>
+          <w:sz w:val="24"/>
+        </w:rPr>
+        <w:t xml:space="preserve">según autorreporte de los docentes participantes</w:t>
+      </w:r>
+      <w:r>
+        <w:rPr>
+          <w:rFonts w:ascii="Arial" w:hAnsi="Arial" w:cs="Arial" w:eastAsia="Arial"/>
+          <w:sz w:val="24"/>
+        </w:rPr>
+        <w:t xml:space="preserve">, de 40-50 minutos a aproximadamente 5 minutos, manteniendo el formato exigido por la supervisión escolar.</w:t>
       </w:r>
     </w:p>
     <w:p>
@@ -861,22 +1679,31 @@
           <w:ilvl w:val="0"/>
           <w:numId w:val="1004"/>
         </w:numPr>
-      </w:pPr>
-      <w:r>
-        <w:t xml:space="preserve">Secretaría de Educación Pública. (2022).</w:t>
-      </w:r>
-      <w:r>
-        <w:t xml:space="preserve"> </w:t>
-      </w:r>
-      <w:r>
-        <w:rPr>
-          <w:i/>
-          <w:iCs/>
-        </w:rPr>
-        <w:t xml:space="preserve">Marco Curricular Común de la Educación Media Superior</w:t>
-      </w:r>
-      <w:r>
-        <w:t xml:space="preserve">. Subsecretaría de Educación Media Superior.</w:t>
+        <w:spacing w:line="360" w:lineRule="auto" w:before="0" w:after="0"/>
+        <w:jc w:val="both"/>
+      </w:pPr>
+      <w:r>
+        <w:rPr>
+          <w:rFonts w:ascii="Arial" w:hAnsi="Arial" w:cs="Arial" w:eastAsia="Arial"/>
+          <w:b/>
+          <w:bCs/>
+          <w:sz w:val="24"/>
+        </w:rPr>
+        <w:t xml:space="preserve">Retención voluntaria del 100%:</w:t>
+      </w:r>
+      <w:r>
+        <w:rPr>
+          <w:rFonts w:ascii="Arial" w:hAnsi="Arial" w:cs="Arial" w:eastAsia="Arial"/>
+          <w:sz w:val="24"/>
+        </w:rPr>
+        <w:t xml:space="preserve"> </w:t>
+      </w:r>
+      <w:r>
+        <w:rPr>
+          <w:rFonts w:ascii="Arial" w:hAnsi="Arial" w:cs="Arial" w:eastAsia="Arial"/>
+          <w:sz w:val="24"/>
+        </w:rPr>
+        <w:t xml:space="preserve">los 7 docentes que probaron la plataforma regresaron a usarla sin requerimiento administrativo, y la valoración cualitativa destaca la calidad del documento entregable.</w:t>
       </w:r>
     </w:p>
     <w:p>
@@ -886,26 +1713,93 @@
           <w:ilvl w:val="0"/>
           <w:numId w:val="1004"/>
         </w:numPr>
-      </w:pPr>
-      <w:r>
-        <w:t xml:space="preserve">[Referencia sobre carga administrativa docente / uso de IA en educación que quieras citar]</w:t>
-      </w:r>
-    </w:p>
-    <w:p>
-      <w:r>
-        <w:pict>
-          <v:rect style="width:0;height:1.5pt" o:hralign="center" o:hrstd="t" o:hr="t"/>
-        </w:pict>
-      </w:r>
-    </w:p>
-    <w:bookmarkEnd w:id="18"/>
-    <w:bookmarkStart w:id="19" w:name="Xb6e41e13045843ddc192f6438a66a3fc26d222b"/>
-    <w:p>
-      <w:pPr>
-        <w:pStyle w:val="Heading2"/>
-      </w:pPr>
-      <w:r>
-        <w:t xml:space="preserve">📋 Checklist antes de enviar (no incluir en el documento)</w:t>
+        <w:spacing w:line="360" w:lineRule="auto" w:before="0" w:after="0"/>
+        <w:jc w:val="both"/>
+      </w:pPr>
+      <w:r>
+        <w:rPr>
+          <w:rFonts w:ascii="Arial" w:hAnsi="Arial" w:cs="Arial" w:eastAsia="Arial"/>
+          <w:sz w:val="24"/>
+        </w:rPr>
+        <w:t xml:space="preserve">Las planeaciones incorporan ahora progresiones oficiales textuales del MCCEMS (76 unidades de aprendizaje curricular con contenido oficial verificado integradas a la plataforma), reduciendo el riesgo de desalineación curricular entre planes de estudio 2023-2026 y 2025-2028.</w:t>
+      </w:r>
+    </w:p>
+    <w:p>
+      <w:pPr>
+        <w:pStyle w:val="Compact"/>
+        <w:numPr>
+          <w:ilvl w:val="0"/>
+          <w:numId w:val="1004"/>
+        </w:numPr>
+        <w:spacing w:line="360" w:lineRule="auto" w:before="0" w:after="0"/>
+        <w:jc w:val="both"/>
+      </w:pPr>
+      <w:r>
+        <w:rPr>
+          <w:rFonts w:ascii="Arial" w:hAnsi="Arial" w:cs="Arial" w:eastAsia="Arial"/>
+          <w:sz w:val="24"/>
+        </w:rPr>
+        <w:t xml:space="preserve">El diagnóstico socioeducativo dejó de ser un trámite archivado: alimenta directamente la generación de cada planeación con adaptaciones explícitas y verificables en el documento.</w:t>
+      </w:r>
+    </w:p>
+    <w:p>
+      <w:pPr>
+        <w:pStyle w:val="FirstParagraph"/>
+        <w:spacing w:line="360" w:lineRule="auto" w:before="0" w:after="0"/>
+        <w:jc w:val="both"/>
+      </w:pPr>
+      <w:r>
+        <w:rPr>
+          <w:rFonts w:ascii="Arial" w:hAnsi="Arial" w:cs="Arial" w:eastAsia="Arial"/>
+          <w:b/>
+          <w:bCs/>
+          <w:sz w:val="24"/>
+        </w:rPr>
+        <w:t xml:space="preserve">Lectura comparada.</w:t>
+      </w:r>
+      <w:r>
+        <w:rPr>
+          <w:rFonts w:ascii="Arial" w:hAnsi="Arial" w:cs="Arial" w:eastAsia="Arial"/>
+          <w:sz w:val="24"/>
+        </w:rPr>
+        <w:t xml:space="preserve"> </w:t>
+      </w:r>
+      <w:r>
+        <w:rPr>
+          <w:rFonts w:ascii="Arial" w:hAnsi="Arial" w:cs="Arial" w:eastAsia="Arial"/>
+          <w:sz w:val="24"/>
+        </w:rPr>
+        <w:t xml:space="preserve">La magnitud del ahorro es congruente con la documentada por Shiksha Copilot con 1,043 docentes en India (Varuvel Dennison et al., 2025), si bien aquella cifra proviene de medición sistemática y la presente del registro de un plantel. La coincidencia direccional respalda la plausibilidad del resultado; no lo sustituye.</w:t>
+      </w:r>
+    </w:p>
+    <w:p>
+      <w:pPr>
+        <w:pStyle w:val="BodyText"/>
+        <w:spacing w:line="360" w:lineRule="auto" w:before="0" w:after="0"/>
+        <w:jc w:val="both"/>
+      </w:pPr>
+      <w:r>
+        <w:rPr>
+          <w:rFonts w:ascii="Arial" w:hAnsi="Arial" w:cs="Arial" w:eastAsia="Arial"/>
+          <w:b/>
+          <w:bCs/>
+          <w:sz w:val="24"/>
+        </w:rPr>
+        <w:t xml:space="preserve">Limitaciones.</w:t>
+      </w:r>
+      <w:r>
+        <w:rPr>
+          <w:rFonts w:ascii="Arial" w:hAnsi="Arial" w:cs="Arial" w:eastAsia="Arial"/>
+          <w:sz w:val="24"/>
+        </w:rPr>
+        <w:t xml:space="preserve"> </w:t>
+      </w:r>
+      <w:r>
+        <w:rPr>
+          <w:rFonts w:ascii="Arial" w:hAnsi="Arial" w:cs="Arial" w:eastAsia="Arial"/>
+          <w:sz w:val="24"/>
+        </w:rPr>
+        <w:t xml:space="preserve">Los resultados deben leerse con seis restricciones explícitas:</w:t>
       </w:r>
     </w:p>
     <w:p>
@@ -915,19 +1809,31 @@
           <w:ilvl w:val="0"/>
           <w:numId w:val="1005"/>
         </w:numPr>
-      </w:pPr>
-      <w:r>
-        <w:t xml:space="preserve">Pasar a Word: Arial 12, interlineado 1.5, títulos en negritas,</w:t>
-      </w:r>
-      <w:r>
-        <w:t xml:space="preserve"> </w:t>
-      </w:r>
-      <w:r>
-        <w:rPr>
+        <w:spacing w:line="360" w:lineRule="auto" w:before="0" w:after="0"/>
+        <w:jc w:val="both"/>
+      </w:pPr>
+      <w:r>
+        <w:rPr>
+          <w:rFonts w:ascii="Arial" w:hAnsi="Arial" w:cs="Arial" w:eastAsia="Arial"/>
           <w:b/>
           <w:bCs/>
-        </w:rPr>
-        <w:t xml:space="preserve">máximo 10 cuartillas</w:t>
+          <w:sz w:val="24"/>
+        </w:rPr>
+        <w:t xml:space="preserve">El resultado central proviene de autorreporte:</w:t>
+      </w:r>
+      <w:r>
+        <w:rPr>
+          <w:rFonts w:ascii="Arial" w:hAnsi="Arial" w:cs="Arial" w:eastAsia="Arial"/>
+          <w:sz w:val="24"/>
+        </w:rPr>
+        <w:t xml:space="preserve"> </w:t>
+      </w:r>
+      <w:r>
+        <w:rPr>
+          <w:rFonts w:ascii="Arial" w:hAnsi="Arial" w:cs="Arial" w:eastAsia="Arial"/>
+          <w:sz w:val="24"/>
+        </w:rPr>
+        <w:t xml:space="preserve">la reducción fue estimada por los docentes, no cronometrada. Documenta un cambio percibido, no medido. El contraste con la analítica de la plataforma está en curso.</w:t>
       </w:r>
     </w:p>
     <w:p>
@@ -935,11 +1841,33 @@
         <w:pStyle w:val="Compact"/>
         <w:numPr>
           <w:ilvl w:val="0"/>
-          <w:numId w:val="1006"/>
+          <w:numId w:val="1005"/>
         </w:numPr>
-      </w:pPr>
-      <w:r>
-        <w:t xml:space="preserve">Completar apellidos, correo y afiliación IBERO</w:t>
+        <w:spacing w:line="360" w:lineRule="auto" w:before="0" w:after="0"/>
+        <w:jc w:val="both"/>
+      </w:pPr>
+      <w:r>
+        <w:rPr>
+          <w:rFonts w:ascii="Arial" w:hAnsi="Arial" w:cs="Arial" w:eastAsia="Arial"/>
+          <w:b/>
+          <w:bCs/>
+          <w:sz w:val="24"/>
+        </w:rPr>
+        <w:t xml:space="preserve">Muestra reducida y no probabilística:</w:t>
+      </w:r>
+      <w:r>
+        <w:rPr>
+          <w:rFonts w:ascii="Arial" w:hAnsi="Arial" w:cs="Arial" w:eastAsia="Arial"/>
+          <w:sz w:val="24"/>
+        </w:rPr>
+        <w:t xml:space="preserve"> </w:t>
+      </w:r>
+      <w:r>
+        <w:rPr>
+          <w:rFonts w:ascii="Arial" w:hAnsi="Arial" w:cs="Arial" w:eastAsia="Arial"/>
+          <w:sz w:val="24"/>
+        </w:rPr>
+        <w:t xml:space="preserve">siete docentes de un solo plantel, con participación voluntaria, lo que introduce un probable sesgo de autoselección hacia el profesorado más dispuesto a incorporar herramientas digitales. El amplio rango de antigüedad atenúa parcialmente este sesgo, sin eliminarlo.</w:t>
       </w:r>
     </w:p>
     <w:p>
@@ -947,11 +1875,33 @@
         <w:pStyle w:val="Compact"/>
         <w:numPr>
           <w:ilvl w:val="0"/>
-          <w:numId w:val="1007"/>
+          <w:numId w:val="1005"/>
         </w:numPr>
-      </w:pPr>
-      <w:r>
-        <w:t xml:space="preserve">Actualizar sección h con datos de analítica reales si ya activaste el MEASUREMENT_ID</w:t>
+        <w:spacing w:line="360" w:lineRule="auto" w:before="0" w:after="0"/>
+        <w:jc w:val="both"/>
+      </w:pPr>
+      <w:r>
+        <w:rPr>
+          <w:rFonts w:ascii="Arial" w:hAnsi="Arial" w:cs="Arial" w:eastAsia="Arial"/>
+          <w:b/>
+          <w:bCs/>
+          <w:sz w:val="24"/>
+        </w:rPr>
+        <w:t xml:space="preserve">No se documentó la experiencia previa</w:t>
+      </w:r>
+      <w:r>
+        <w:rPr>
+          <w:rFonts w:ascii="Arial" w:hAnsi="Arial" w:cs="Arial" w:eastAsia="Arial"/>
+          <w:sz w:val="24"/>
+        </w:rPr>
+        <w:t xml:space="preserve"> </w:t>
+      </w:r>
+      <w:r>
+        <w:rPr>
+          <w:rFonts w:ascii="Arial" w:hAnsi="Arial" w:cs="Arial" w:eastAsia="Arial"/>
+          <w:sz w:val="24"/>
+        </w:rPr>
+        <w:t xml:space="preserve">de los participantes con inteligencia artificial, dato que habría permitido distinguir el efecto de la plataforma del de la familiarización general con estas tecnologías.</w:t>
       </w:r>
     </w:p>
     <w:p>
@@ -959,37 +1909,33 @@
         <w:pStyle w:val="Compact"/>
         <w:numPr>
           <w:ilvl w:val="0"/>
-          <w:numId w:val="1008"/>
+          <w:numId w:val="1005"/>
         </w:numPr>
-      </w:pPr>
-      <w:r>
-        <w:t xml:space="preserve">Enviar a</w:t>
-      </w:r>
-      <w:r>
-        <w:t xml:space="preserve"> </w:t>
-      </w:r>
-      <w:r>
-        <w:rPr>
+        <w:spacing w:line="360" w:lineRule="auto" w:before="0" w:after="0"/>
+        <w:jc w:val="both"/>
+      </w:pPr>
+      <w:r>
+        <w:rPr>
+          <w:rFonts w:ascii="Arial" w:hAnsi="Arial" w:cs="Arial" w:eastAsia="Arial"/>
           <w:b/>
           <w:bCs/>
-        </w:rPr>
-        <w:t xml:space="preserve">innovacion.educativa@iberopuebla.mx</w:t>
-      </w:r>
-      <w:r>
-        <w:t xml:space="preserve"> </w:t>
-      </w:r>
-      <w:r>
-        <w:t xml:space="preserve">antes del</w:t>
-      </w:r>
-      <w:r>
-        <w:t xml:space="preserve"> </w:t>
-      </w:r>
-      <w:r>
-        <w:rPr>
-          <w:b/>
-          <w:bCs/>
-        </w:rPr>
-        <w:t xml:space="preserve">16 de agosto de 2026</w:t>
+          <w:sz w:val="24"/>
+        </w:rPr>
+        <w:t xml:space="preserve">Ausencia de grupo de comparación:</w:t>
+      </w:r>
+      <w:r>
+        <w:rPr>
+          <w:rFonts w:ascii="Arial" w:hAnsi="Arial" w:cs="Arial" w:eastAsia="Arial"/>
+          <w:sz w:val="24"/>
+        </w:rPr>
+        <w:t xml:space="preserve"> </w:t>
+      </w:r>
+      <w:r>
+        <w:rPr>
+          <w:rFonts w:ascii="Arial" w:hAnsi="Arial" w:cs="Arial" w:eastAsia="Arial"/>
+          <w:sz w:val="24"/>
+        </w:rPr>
+        <w:t xml:space="preserve">no es posible atribuir causalmente la reducción a la plataforma frente a otros factores, como la familiarización progresiva con el formato.</w:t>
       </w:r>
     </w:p>
     <w:p>
@@ -997,19 +1943,1003 @@
         <w:pStyle w:val="Compact"/>
         <w:numPr>
           <w:ilvl w:val="0"/>
-          <w:numId w:val="1009"/>
+          <w:numId w:val="1005"/>
         </w:numPr>
-      </w:pPr>
-      <w:r>
-        <w:t xml:space="preserve">NO pagar inscripción todavía: los ponentes pagan ($500 MXN) solo después de ser aceptados (resultados: 21-25 de septiembre)</w:t>
-      </w:r>
-    </w:p>
-    <w:bookmarkEnd w:id="19"/>
-    <w:bookmarkEnd w:id="20"/>
+        <w:spacing w:line="360" w:lineRule="auto" w:before="0" w:after="0"/>
+        <w:jc w:val="both"/>
+      </w:pPr>
+      <w:r>
+        <w:rPr>
+          <w:rFonts w:ascii="Arial" w:hAnsi="Arial" w:cs="Arial" w:eastAsia="Arial"/>
+          <w:b/>
+          <w:bCs/>
+          <w:sz w:val="24"/>
+        </w:rPr>
+        <w:t xml:space="preserve">Doble rol del autor</w:t>
+      </w:r>
+      <w:r>
+        <w:rPr>
+          <w:rFonts w:ascii="Arial" w:hAnsi="Arial" w:cs="Arial" w:eastAsia="Arial"/>
+          <w:sz w:val="24"/>
+        </w:rPr>
+        <w:t xml:space="preserve"> </w:t>
+      </w:r>
+      <w:r>
+        <w:rPr>
+          <w:rFonts w:ascii="Arial" w:hAnsi="Arial" w:cs="Arial" w:eastAsia="Arial"/>
+          <w:sz w:val="24"/>
+        </w:rPr>
+        <w:t xml:space="preserve">como desarrollador y observador, declarado en el apartado metodológico.</w:t>
+      </w:r>
+    </w:p>
+    <w:p>
+      <w:pPr>
+        <w:pStyle w:val="Compact"/>
+        <w:numPr>
+          <w:ilvl w:val="0"/>
+          <w:numId w:val="1005"/>
+        </w:numPr>
+        <w:spacing w:line="360" w:lineRule="auto" w:before="0" w:after="0"/>
+        <w:jc w:val="both"/>
+      </w:pPr>
+      <w:r>
+        <w:rPr>
+          <w:rFonts w:ascii="Arial" w:hAnsi="Arial" w:cs="Arial" w:eastAsia="Arial"/>
+          <w:b/>
+          <w:bCs/>
+          <w:sz w:val="24"/>
+        </w:rPr>
+        <w:t xml:space="preserve">Ausencia de evaluación independiente de la calidad:</w:t>
+      </w:r>
+      <w:r>
+        <w:rPr>
+          <w:rFonts w:ascii="Arial" w:hAnsi="Arial" w:cs="Arial" w:eastAsia="Arial"/>
+          <w:sz w:val="24"/>
+        </w:rPr>
+        <w:t xml:space="preserve"> </w:t>
+      </w:r>
+      <w:r>
+        <w:rPr>
+          <w:rFonts w:ascii="Arial" w:hAnsi="Arial" w:cs="Arial" w:eastAsia="Arial"/>
+          <w:sz w:val="24"/>
+        </w:rPr>
+        <w:t xml:space="preserve">se documenta el tiempo y la retención de uso, no el efecto sobre el aprendizaje del estudiantado, que queda fuera del alcance de esta práctica.</w:t>
+      </w:r>
+    </w:p>
+    <w:p>
+      <w:pPr>
+        <w:pStyle w:val="FirstParagraph"/>
+        <w:spacing w:line="360" w:lineRule="auto" w:before="0" w:after="0"/>
+        <w:jc w:val="both"/>
+      </w:pPr>
+      <w:r>
+        <w:rPr>
+          <w:rFonts w:ascii="Arial" w:hAnsi="Arial" w:cs="Arial" w:eastAsia="Arial"/>
+          <w:b/>
+          <w:bCs/>
+          <w:sz w:val="24"/>
+        </w:rPr>
+        <w:t xml:space="preserve">Evaluación en curso.</w:t>
+      </w:r>
+      <w:r>
+        <w:rPr>
+          <w:rFonts w:ascii="Arial" w:hAnsi="Arial" w:cs="Arial" w:eastAsia="Arial"/>
+          <w:sz w:val="24"/>
+        </w:rPr>
+        <w:t xml:space="preserve"> </w:t>
+      </w:r>
+      <w:r>
+        <w:rPr>
+          <w:rFonts w:ascii="Arial" w:hAnsi="Arial" w:cs="Arial" w:eastAsia="Arial"/>
+          <w:sz w:val="24"/>
+        </w:rPr>
+        <w:t xml:space="preserve">Para atender las primeras limitaciones se diseñó un piloto de seis semanas: (a) encuesta pre y post sobre tiempo de planeación, carga percibida y apropiación del MCCEMS; (b) registro objetivo de tiempos mediante la analítica, contrastado con el autorreporte; (c)</w:t>
+      </w:r>
+      <w:r>
+        <w:rPr>
+          <w:rFonts w:ascii="Arial" w:hAnsi="Arial" w:cs="Arial" w:eastAsia="Arial"/>
+          <w:sz w:val="24"/>
+        </w:rPr>
+        <w:t xml:space="preserve"> </w:t>
+      </w:r>
+      <w:r>
+        <w:rPr>
+          <w:rFonts w:ascii="Arial" w:hAnsi="Arial" w:cs="Arial" w:eastAsia="Arial"/>
+          <w:b/>
+          <w:bCs/>
+          <w:sz w:val="24"/>
+        </w:rPr>
+        <w:t xml:space="preserve">evaluación ciega de la calidad mediante rúbrica aplicada por doble juez independiente</w:t>
+      </w:r>
+      <w:r>
+        <w:rPr>
+          <w:rFonts w:ascii="Arial" w:hAnsi="Arial" w:cs="Arial" w:eastAsia="Arial"/>
+          <w:sz w:val="24"/>
+        </w:rPr>
+        <w:t xml:space="preserve"> </w:t>
+      </w:r>
+      <w:r>
+        <w:rPr>
+          <w:rFonts w:ascii="Arial" w:hAnsi="Arial" w:cs="Arial" w:eastAsia="Arial"/>
+          <w:sz w:val="24"/>
+        </w:rPr>
+        <w:t xml:space="preserve">—dos docentes ajenos al desarrollo—, con planeaciones hechas con y sin la plataforma presentadas sin identificar su origen; y (d) medición del acuerdo entre jueces. [Ajusta este párrafo según el avance real que tengas en agosto: si el piloto no ha iniciado, preséntalo como protocolo diseñado; si ya arrancó, indica en qué semana va.]</w:t>
+      </w:r>
+    </w:p>
+    <w:bookmarkEnd w:id="21"/>
+    <w:bookmarkStart w:id="22" w:name="i.-reflexión-sobre-la-práctica"/>
+    <w:p>
+      <w:pPr>
+        <w:pStyle w:val="Heading2"/>
+        <w:keepNext/>
+        <w:spacing w:line="360" w:lineRule="auto" w:before="80" w:after="40"/>
+      </w:pPr>
+      <w:r>
+        <w:rPr>
+          <w:rFonts w:ascii="Arial" w:hAnsi="Arial" w:cs="Arial" w:eastAsia="Arial"/>
+          <w:b/>
+          <w:sz w:val="24"/>
+        </w:rPr>
+        <w:t xml:space="preserve">i. Reflexión sobre la práctica</w:t>
+      </w:r>
+    </w:p>
+    <w:p>
+      <w:pPr>
+        <w:pStyle w:val="FirstParagraph"/>
+        <w:spacing w:line="360" w:lineRule="auto" w:before="0" w:after="0"/>
+        <w:jc w:val="both"/>
+      </w:pPr>
+      <w:r>
+        <w:rPr>
+          <w:rFonts w:ascii="Arial" w:hAnsi="Arial" w:cs="Arial" w:eastAsia="Arial"/>
+          <w:sz w:val="24"/>
+        </w:rPr>
+        <w:t xml:space="preserve">La experiencia deja tres aprendizajes que considero transferibles a otros contextos educativos:</w:t>
+      </w:r>
+    </w:p>
+    <w:p>
+      <w:pPr>
+        <w:pStyle w:val="BodyText"/>
+        <w:spacing w:line="360" w:lineRule="auto" w:before="0" w:after="0"/>
+        <w:jc w:val="both"/>
+      </w:pPr>
+      <w:r>
+        <w:rPr>
+          <w:rFonts w:ascii="Arial" w:hAnsi="Arial" w:cs="Arial" w:eastAsia="Arial"/>
+          <w:b/>
+          <w:bCs/>
+          <w:sz w:val="24"/>
+        </w:rPr>
+        <w:t xml:space="preserve">1. La innovación con IA no es un problema de tecnología sino de criterio pedagógico incorporado.</w:t>
+      </w:r>
+      <w:r>
+        <w:rPr>
+          <w:rFonts w:ascii="Arial" w:hAnsi="Arial" w:cs="Arial" w:eastAsia="Arial"/>
+          <w:sz w:val="24"/>
+        </w:rPr>
+        <w:t xml:space="preserve"> </w:t>
+      </w:r>
+      <w:r>
+        <w:rPr>
+          <w:rFonts w:ascii="Arial" w:hAnsi="Arial" w:cs="Arial" w:eastAsia="Arial"/>
+          <w:sz w:val="24"/>
+        </w:rPr>
+        <w:t xml:space="preserve">La diferencia entre un chat genérico y EduPlan MX no está en el modelo de lenguaje —es la misma tecnología—, sino en dónde reside el conocimiento pedagógico: el currículo oficial, el formato de la supervisión, el diagnóstico del grupo y las metodologías activas viven en el sistema, de modo que el docente no necesita ser experto en</w:t>
+      </w:r>
+      <w:r>
+        <w:rPr>
+          <w:rFonts w:ascii="Arial" w:hAnsi="Arial" w:cs="Arial" w:eastAsia="Arial"/>
+          <w:sz w:val="24"/>
+        </w:rPr>
+        <w:t xml:space="preserve"> </w:t>
+      </w:r>
+      <w:r>
+        <w:rPr>
+          <w:rFonts w:ascii="Arial" w:hAnsi="Arial" w:cs="Arial" w:eastAsia="Arial"/>
+          <w:sz w:val="24"/>
+        </w:rPr>
+        <w:t xml:space="preserve">“prompts”</w:t>
+      </w:r>
+      <w:r>
+        <w:rPr>
+          <w:rFonts w:ascii="Arial" w:hAnsi="Arial" w:cs="Arial" w:eastAsia="Arial"/>
+          <w:sz w:val="24"/>
+        </w:rPr>
+        <w:t xml:space="preserve"> </w:t>
+      </w:r>
+      <w:r>
+        <w:rPr>
+          <w:rFonts w:ascii="Arial" w:hAnsi="Arial" w:cs="Arial" w:eastAsia="Arial"/>
+          <w:sz w:val="24"/>
+        </w:rPr>
+        <w:t xml:space="preserve">para obtener un resultado situado. Democratizar la IA para el profesorado significa esto: que el costo de entrada no sea la ingeniería de instrucciones.</w:t>
+      </w:r>
+    </w:p>
+    <w:p>
+      <w:pPr>
+        <w:pStyle w:val="BodyText"/>
+        <w:spacing w:line="360" w:lineRule="auto" w:before="0" w:after="0"/>
+        <w:jc w:val="both"/>
+      </w:pPr>
+      <w:r>
+        <w:rPr>
+          <w:rFonts w:ascii="Arial" w:hAnsi="Arial" w:cs="Arial" w:eastAsia="Arial"/>
+          <w:b/>
+          <w:bCs/>
+          <w:sz w:val="24"/>
+        </w:rPr>
+        <w:t xml:space="preserve">2. Reducir carga administrativa es una intervención pedagógica, no solo de gestión.</w:t>
+      </w:r>
+      <w:r>
+        <w:rPr>
+          <w:rFonts w:ascii="Arial" w:hAnsi="Arial" w:cs="Arial" w:eastAsia="Arial"/>
+          <w:sz w:val="24"/>
+        </w:rPr>
+        <w:t xml:space="preserve"> </w:t>
+      </w:r>
+      <w:r>
+        <w:rPr>
+          <w:rFonts w:ascii="Arial" w:hAnsi="Arial" w:cs="Arial" w:eastAsia="Arial"/>
+          <w:sz w:val="24"/>
+        </w:rPr>
+        <w:t xml:space="preserve">Los 45 minutos recuperados no desaparecen: se convierten en tiempo para retroalimentar estudiantes, diseñar materiales y —de manera visible en esta práctica— mirar los datos del diagnóstico grupal que antes nadie tenía tiempo de leer. La condición de posibilidad de la enseñanza contextualizada es el tiempo docente.</w:t>
+      </w:r>
+    </w:p>
+    <w:p>
+      <w:pPr>
+        <w:pStyle w:val="BodyText"/>
+        <w:spacing w:line="360" w:lineRule="auto" w:before="0" w:after="0"/>
+        <w:jc w:val="both"/>
+      </w:pPr>
+      <w:r>
+        <w:rPr>
+          <w:rFonts w:ascii="Arial" w:hAnsi="Arial" w:cs="Arial" w:eastAsia="Arial"/>
+          <w:b/>
+          <w:bCs/>
+          <w:sz w:val="24"/>
+        </w:rPr>
+        <w:t xml:space="preserve">3. La honestidad del sistema es una postura ética frente a la IA generativa.</w:t>
+      </w:r>
+      <w:r>
+        <w:rPr>
+          <w:rFonts w:ascii="Arial" w:hAnsi="Arial" w:cs="Arial" w:eastAsia="Arial"/>
+          <w:sz w:val="24"/>
+        </w:rPr>
+        <w:t xml:space="preserve"> </w:t>
+      </w:r>
+      <w:r>
+        <w:rPr>
+          <w:rFonts w:ascii="Arial" w:hAnsi="Arial" w:cs="Arial" w:eastAsia="Arial"/>
+          <w:sz w:val="24"/>
+        </w:rPr>
+        <w:t xml:space="preserve">Durante el desarrollo se detectó que la IA podía</w:t>
+      </w:r>
+      <w:r>
+        <w:rPr>
+          <w:rFonts w:ascii="Arial" w:hAnsi="Arial" w:cs="Arial" w:eastAsia="Arial"/>
+          <w:sz w:val="24"/>
+        </w:rPr>
+        <w:t xml:space="preserve"> </w:t>
+      </w:r>
+      <w:r>
+        <w:rPr>
+          <w:rFonts w:ascii="Arial" w:hAnsi="Arial" w:cs="Arial" w:eastAsia="Arial"/>
+          <w:sz w:val="24"/>
+        </w:rPr>
+        <w:t xml:space="preserve">“rellenar”</w:t>
+      </w:r>
+      <w:r>
+        <w:rPr>
+          <w:rFonts w:ascii="Arial" w:hAnsi="Arial" w:cs="Arial" w:eastAsia="Arial"/>
+          <w:sz w:val="24"/>
+        </w:rPr>
+        <w:t xml:space="preserve"> </w:t>
+      </w:r>
+      <w:r>
+        <w:rPr>
+          <w:rFonts w:ascii="Arial" w:hAnsi="Arial" w:cs="Arial" w:eastAsia="Arial"/>
+          <w:sz w:val="24"/>
+        </w:rPr>
+        <w:t xml:space="preserve">progresiones inexistentes con texto verosímil. La decisión fue advertir al docente cuando un programa no está verificado contra el documento oficial, en lugar de simular certeza. En tiempos de desinformación, enseñar y diseñar con IA exige sistemas que sepan decir</w:t>
+      </w:r>
+      <w:r>
+        <w:rPr>
+          <w:rFonts w:ascii="Arial" w:hAnsi="Arial" w:cs="Arial" w:eastAsia="Arial"/>
+          <w:sz w:val="24"/>
+        </w:rPr>
+        <w:t xml:space="preserve"> </w:t>
+      </w:r>
+      <w:r>
+        <w:rPr>
+          <w:rFonts w:ascii="Arial" w:hAnsi="Arial" w:cs="Arial" w:eastAsia="Arial"/>
+          <w:sz w:val="24"/>
+        </w:rPr>
+        <w:t xml:space="preserve">“esto no lo sé”</w:t>
+      </w:r>
+      <w:r>
+        <w:rPr>
+          <w:rFonts w:ascii="Arial" w:hAnsi="Arial" w:cs="Arial" w:eastAsia="Arial"/>
+          <w:sz w:val="24"/>
+        </w:rPr>
+        <w:t xml:space="preserve">.</w:t>
+      </w:r>
+    </w:p>
+    <w:p>
+      <w:pPr>
+        <w:pStyle w:val="BodyText"/>
+        <w:spacing w:line="360" w:lineRule="auto" w:before="0" w:after="0"/>
+        <w:jc w:val="both"/>
+      </w:pPr>
+      <w:r>
+        <w:rPr>
+          <w:rFonts w:ascii="Arial" w:hAnsi="Arial" w:cs="Arial" w:eastAsia="Arial"/>
+          <w:sz w:val="24"/>
+        </w:rPr>
+        <w:t xml:space="preserve">Queda abierta una tensión que la práctica no resuelve del todo: que la facilidad de generación produzca planeaciones entregadas sin apropiación. La crítica está documentada. Selwyn (2019) advierte que cuando el profesorado depende de clases generadas sin adaptarlas críticamente se produce una enseñanza estandarizada y descontextualizada que desprofesionaliza: el docente experimenta alivio de la carga rutinaria mientras pierde ocasiones de ejercer juicio pedagógico. Mishra, Warr e Islam (2023) añaden que la IA generativa vuelve</w:t>
+      </w:r>
+      <w:r>
+        <w:rPr>
+          <w:rFonts w:ascii="Arial" w:hAnsi="Arial" w:cs="Arial" w:eastAsia="Arial"/>
+          <w:sz w:val="24"/>
+        </w:rPr>
+        <w:t xml:space="preserve"> </w:t>
+      </w:r>
+      <w:r>
+        <w:rPr>
+          <w:rFonts w:ascii="Arial" w:hAnsi="Arial" w:cs="Arial" w:eastAsia="Arial"/>
+          <w:i/>
+          <w:iCs/>
+          <w:sz w:val="24"/>
+        </w:rPr>
+        <w:t xml:space="preserve">más</w:t>
+      </w:r>
+      <w:r>
+        <w:rPr>
+          <w:rFonts w:ascii="Arial" w:hAnsi="Arial" w:cs="Arial" w:eastAsia="Arial"/>
+          <w:sz w:val="24"/>
+        </w:rPr>
+        <w:t xml:space="preserve"> </w:t>
+      </w:r>
+      <w:r>
+        <w:rPr>
+          <w:rFonts w:ascii="Arial" w:hAnsi="Arial" w:cs="Arial" w:eastAsia="Arial"/>
+          <w:sz w:val="24"/>
+        </w:rPr>
+        <w:t xml:space="preserve">exigente el conocimiento profesional docente, por tratarse de herramientas</w:t>
+      </w:r>
+      <w:r>
+        <w:rPr>
+          <w:rFonts w:ascii="Arial" w:hAnsi="Arial" w:cs="Arial" w:eastAsia="Arial"/>
+          <w:sz w:val="24"/>
+        </w:rPr>
+        <w:t xml:space="preserve"> </w:t>
+      </w:r>
+      <w:r>
+        <w:rPr>
+          <w:rFonts w:ascii="Arial" w:hAnsi="Arial" w:cs="Arial" w:eastAsia="Arial"/>
+          <w:sz w:val="24"/>
+        </w:rPr>
+        <w:t xml:space="preserve">“proteicas, opacas e inestables”</w:t>
+      </w:r>
+      <w:r>
+        <w:rPr>
+          <w:rFonts w:ascii="Arial" w:hAnsi="Arial" w:cs="Arial" w:eastAsia="Arial"/>
+          <w:sz w:val="24"/>
+        </w:rPr>
+        <w:t xml:space="preserve">. La UNESCO (2023) fija el criterio: la IA en educación debe servir a las capacidades humanas, no sustituirlas.</w:t>
+      </w:r>
+    </w:p>
+    <w:p>
+      <w:pPr>
+        <w:pStyle w:val="BodyText"/>
+        <w:spacing w:line="360" w:lineRule="auto" w:before="0" w:after="0"/>
+        <w:jc w:val="both"/>
+      </w:pPr>
+      <w:r>
+        <w:rPr>
+          <w:rFonts w:ascii="Arial" w:hAnsi="Arial" w:cs="Arial" w:eastAsia="Arial"/>
+          <w:sz w:val="24"/>
+        </w:rPr>
+        <w:t xml:space="preserve">Antes que desestimarlas, el diseño procuró responder a cada objeción. Se presentan de forma explícita para poder ser evaluadas y discutidas:</w:t>
+      </w:r>
+    </w:p>
+    <w:tbl>
+      <w:tblPr>
+        <w:tblStyle w:val="Table"/>
+        <w:tblW w:type="pct" w:w="5000"/>
+        <w:tblLayout w:type="fixed"/>
+        <w:tblLook w:firstRow="1" w:lastRow="0" w:firstColumn="0" w:lastColumn="0" w:noHBand="0" w:noVBand="0" w:val="0020"/>
+      </w:tblPr>
+      <w:tblGrid>
+        <w:gridCol w:w="3960"/>
+        <w:gridCol w:w="3960"/>
+      </w:tblGrid>
+      <w:tr>
+        <w:trPr>
+          <w:tblHeader w:val="on"/>
+        </w:trPr>
+        <w:tc>
+          <w:tcPr/>
+          <w:p>
+            <w:pPr>
+              <w:pStyle w:val="Compact"/>
+              <w:spacing w:line="240" w:lineRule="auto" w:after="0" w:before="0"/>
+            </w:pPr>
+            <w:r>
+              <w:rPr>
+                <w:rFonts w:ascii="Arial" w:hAnsi="Arial" w:cs="Arial" w:eastAsia="Arial"/>
+                <w:sz w:val="20"/>
+              </w:rPr>
+              <w:t xml:space="preserve">Riesgo documentado</w:t>
+            </w:r>
+          </w:p>
+        </w:tc>
+        <w:tc>
+          <w:tcPr/>
+          <w:p>
+            <w:pPr>
+              <w:pStyle w:val="Compact"/>
+              <w:spacing w:line="240" w:lineRule="auto" w:after="0" w:before="0"/>
+            </w:pPr>
+            <w:r>
+              <w:rPr>
+                <w:rFonts w:ascii="Arial" w:hAnsi="Arial" w:cs="Arial" w:eastAsia="Arial"/>
+                <w:sz w:val="20"/>
+              </w:rPr>
+              <w:t xml:space="preserve">Decisión de diseño adoptada</w:t>
+            </w:r>
+          </w:p>
+        </w:tc>
+      </w:tr>
+      <w:tr>
+        <w:tc>
+          <w:tcPr/>
+          <w:p>
+            <w:pPr>
+              <w:pStyle w:val="Compact"/>
+              <w:spacing w:line="240" w:lineRule="auto" w:after="0" w:before="0"/>
+            </w:pPr>
+            <w:r>
+              <w:rPr>
+                <w:rFonts w:ascii="Arial" w:hAnsi="Arial" w:cs="Arial" w:eastAsia="Arial"/>
+                <w:sz w:val="20"/>
+              </w:rPr>
+              <w:t xml:space="preserve">Descontextualización (Selwyn, 2019)</w:t>
+            </w:r>
+          </w:p>
+        </w:tc>
+        <w:tc>
+          <w:tcPr/>
+          <w:p>
+            <w:pPr>
+              <w:pStyle w:val="Compact"/>
+              <w:spacing w:line="240" w:lineRule="auto" w:after="0" w:before="0"/>
+            </w:pPr>
+            <w:r>
+              <w:rPr>
+                <w:rFonts w:ascii="Arial" w:hAnsi="Arial" w:cs="Arial" w:eastAsia="Arial"/>
+                <w:sz w:val="20"/>
+              </w:rPr>
+              <w:t xml:space="preserve">Diagnóstico socioeducativo grupal obligatorio; la adaptación al grupo aparece etiquetada y visible en el entregable</w:t>
+            </w:r>
+          </w:p>
+        </w:tc>
+      </w:tr>
+      <w:tr>
+        <w:tc>
+          <w:tcPr/>
+          <w:p>
+            <w:pPr>
+              <w:pStyle w:val="Compact"/>
+              <w:spacing w:line="240" w:lineRule="auto" w:after="0" w:before="0"/>
+            </w:pPr>
+            <w:r>
+              <w:rPr>
+                <w:rFonts w:ascii="Arial" w:hAnsi="Arial" w:cs="Arial" w:eastAsia="Arial"/>
+                <w:sz w:val="20"/>
+              </w:rPr>
+              <w:t xml:space="preserve">Pérdida del juicio profesional</w:t>
+            </w:r>
+          </w:p>
+        </w:tc>
+        <w:tc>
+          <w:tcPr/>
+          <w:p>
+            <w:pPr>
+              <w:pStyle w:val="Compact"/>
+              <w:spacing w:line="240" w:lineRule="auto" w:after="0" w:before="0"/>
+            </w:pPr>
+            <w:r>
+              <w:rPr>
+                <w:rFonts w:ascii="Arial" w:hAnsi="Arial" w:cs="Arial" w:eastAsia="Arial"/>
+                <w:sz w:val="20"/>
+              </w:rPr>
+              <w:t xml:space="preserve">El docente selecciona progresión, necesidad pedagógica, metodología y evaluación; el sistema redacta y estructura, no decide</w:t>
+            </w:r>
+          </w:p>
+        </w:tc>
+      </w:tr>
+      <w:tr>
+        <w:tc>
+          <w:tcPr/>
+          <w:p>
+            <w:pPr>
+              <w:pStyle w:val="Compact"/>
+              <w:spacing w:line="240" w:lineRule="auto" w:after="0" w:before="0"/>
+            </w:pPr>
+            <w:r>
+              <w:rPr>
+                <w:rFonts w:ascii="Arial" w:hAnsi="Arial" w:cs="Arial" w:eastAsia="Arial"/>
+                <w:sz w:val="20"/>
+              </w:rPr>
+              <w:t xml:space="preserve">Fabricación de contenido curricular</w:t>
+            </w:r>
+          </w:p>
+        </w:tc>
+        <w:tc>
+          <w:tcPr/>
+          <w:p>
+            <w:pPr>
+              <w:pStyle w:val="Compact"/>
+              <w:spacing w:line="240" w:lineRule="auto" w:after="0" w:before="0"/>
+            </w:pPr>
+            <w:r>
+              <w:rPr>
+                <w:rFonts w:ascii="Arial" w:hAnsi="Arial" w:cs="Arial" w:eastAsia="Arial"/>
+                <w:sz w:val="20"/>
+              </w:rPr>
+              <w:t xml:space="preserve">Anclaje en el texto oficial y advertencia cuando un programa no está verificado</w:t>
+            </w:r>
+          </w:p>
+        </w:tc>
+      </w:tr>
+      <w:tr>
+        <w:tc>
+          <w:tcPr/>
+          <w:p>
+            <w:pPr>
+              <w:pStyle w:val="Compact"/>
+              <w:spacing w:line="240" w:lineRule="auto" w:after="0" w:before="0"/>
+            </w:pPr>
+            <w:r>
+              <w:rPr>
+                <w:rFonts w:ascii="Arial" w:hAnsi="Arial" w:cs="Arial" w:eastAsia="Arial"/>
+                <w:sz w:val="20"/>
+              </w:rPr>
+              <w:t xml:space="preserve">Opacidad de la herramienta (Mishra et al., 2023)</w:t>
+            </w:r>
+          </w:p>
+        </w:tc>
+        <w:tc>
+          <w:tcPr/>
+          <w:p>
+            <w:pPr>
+              <w:pStyle w:val="Compact"/>
+              <w:spacing w:line="240" w:lineRule="auto" w:after="0" w:before="0"/>
+            </w:pPr>
+            <w:r>
+              <w:rPr>
+                <w:rFonts w:ascii="Arial" w:hAnsi="Arial" w:cs="Arial" w:eastAsia="Arial"/>
+                <w:sz w:val="20"/>
+              </w:rPr>
+              <w:t xml:space="preserve">Auditor pedagógico integrado que muestra la alineación de lo generado</w:t>
+            </w:r>
+          </w:p>
+        </w:tc>
+      </w:tr>
+      <w:tr>
+        <w:tc>
+          <w:tcPr/>
+          <w:p>
+            <w:pPr>
+              <w:pStyle w:val="Compact"/>
+              <w:spacing w:line="240" w:lineRule="auto" w:after="0" w:before="0"/>
+            </w:pPr>
+            <w:r>
+              <w:rPr>
+                <w:rFonts w:ascii="Arial" w:hAnsi="Arial" w:cs="Arial" w:eastAsia="Arial"/>
+                <w:sz w:val="20"/>
+              </w:rPr>
+              <w:t xml:space="preserve">Vacío normativo (ENIAG 2025: más del 75%)</w:t>
+            </w:r>
+          </w:p>
+        </w:tc>
+        <w:tc>
+          <w:tcPr/>
+          <w:p>
+            <w:pPr>
+              <w:pStyle w:val="Compact"/>
+              <w:spacing w:line="240" w:lineRule="auto" w:after="0" w:before="0"/>
+            </w:pPr>
+            <w:r>
+              <w:rPr>
+                <w:rFonts w:ascii="Arial" w:hAnsi="Arial" w:cs="Arial" w:eastAsia="Arial"/>
+                <w:sz w:val="20"/>
+              </w:rPr>
+              <w:t xml:space="preserve">El currículo oficial y el formato de supervisión residen en el sistema, no en la pericia del usuario para redactar instrucciones</w:t>
+            </w:r>
+          </w:p>
+        </w:tc>
+      </w:tr>
+    </w:tbl>
+    <w:p>
+      <w:pPr>
+        <w:pStyle w:val="BodyText"/>
+        <w:spacing w:line="360" w:lineRule="auto" w:before="0" w:after="0"/>
+        <w:jc w:val="both"/>
+      </w:pPr>
+      <w:r>
+        <w:rPr>
+          <w:rFonts w:ascii="Arial" w:hAnsi="Arial" w:cs="Arial" w:eastAsia="Arial"/>
+          <w:sz w:val="24"/>
+        </w:rPr>
+        <w:t xml:space="preserve">Ninguna de estas decisiones resuelve la tensión de fondo; la desplazan hacia donde puede ser observada. Verificar si el profesorado permanece como autor —y no como espectador— de su planeación es lo que la evaluación ciega descrita en el apartado anterior busca someter a prueba.</w:t>
+      </w:r>
+    </w:p>
+    <w:bookmarkEnd w:id="22"/>
+    <w:bookmarkStart w:id="23" w:name="j.-referencias-formato-apa-7ª-ed."/>
+    <w:p>
+      <w:pPr>
+        <w:pStyle w:val="Heading2"/>
+        <w:keepNext/>
+        <w:spacing w:line="360" w:lineRule="auto" w:before="80" w:after="40"/>
+      </w:pPr>
+      <w:r>
+        <w:rPr>
+          <w:rFonts w:ascii="Arial" w:hAnsi="Arial" w:cs="Arial" w:eastAsia="Arial"/>
+          <w:b/>
+          <w:sz w:val="24"/>
+        </w:rPr>
+        <w:t xml:space="preserve">j. Referencias (formato APA 7ª ed.)</w:t>
+      </w:r>
+    </w:p>
+    <w:p>
+      <w:pPr>
+        <w:pStyle w:val="FirstParagraph"/>
+        <w:spacing w:line="360" w:lineRule="auto" w:before="0" w:after="0"/>
+        <w:jc w:val="both"/>
+      </w:pPr>
+      <w:r>
+        <w:rPr>
+          <w:rFonts w:ascii="Arial" w:hAnsi="Arial" w:cs="Arial" w:eastAsia="Arial"/>
+          <w:sz w:val="24"/>
+        </w:rPr>
+        <w:t xml:space="preserve">Dirección General del Bachillerato. (2025).</w:t>
+      </w:r>
+      <w:r>
+        <w:rPr>
+          <w:rFonts w:ascii="Arial" w:hAnsi="Arial" w:cs="Arial" w:eastAsia="Arial"/>
+          <w:sz w:val="24"/>
+        </w:rPr>
+        <w:t xml:space="preserve"> </w:t>
+      </w:r>
+      <w:r>
+        <w:rPr>
+          <w:rFonts w:ascii="Arial" w:hAnsi="Arial" w:cs="Arial" w:eastAsia="Arial"/>
+          <w:i/>
+          <w:iCs/>
+          <w:sz w:val="24"/>
+        </w:rPr>
+        <w:t xml:space="preserve">Programas de estudio para la generación 2025-2028 y subsecuentes (MCCEMS)</w:t>
+      </w:r>
+      <w:r>
+        <w:rPr>
+          <w:rFonts w:ascii="Arial" w:hAnsi="Arial" w:cs="Arial" w:eastAsia="Arial"/>
+          <w:sz w:val="24"/>
+        </w:rPr>
+        <w:t xml:space="preserve">. Secretaría de Educación Pública. https://dgb.sep.gob.mx/programas-de-estudio</w:t>
+      </w:r>
+    </w:p>
+    <w:p>
+      <w:pPr>
+        <w:pStyle w:val="BodyText"/>
+        <w:spacing w:line="360" w:lineRule="auto" w:before="0" w:after="0"/>
+        <w:jc w:val="both"/>
+      </w:pPr>
+      <w:r>
+        <w:rPr>
+          <w:rFonts w:ascii="Arial" w:hAnsi="Arial" w:cs="Arial" w:eastAsia="Arial"/>
+          <w:sz w:val="24"/>
+        </w:rPr>
+        <w:t xml:space="preserve">Kaka, S. J., &amp; Kessner, T. M. (2026). Bots and beginners: A comparative study of AI- and PST-generated social studies lesson plans.</w:t>
+      </w:r>
+      <w:r>
+        <w:rPr>
+          <w:rFonts w:ascii="Arial" w:hAnsi="Arial" w:cs="Arial" w:eastAsia="Arial"/>
+          <w:sz w:val="24"/>
+        </w:rPr>
+        <w:t xml:space="preserve"> </w:t>
+      </w:r>
+      <w:r>
+        <w:rPr>
+          <w:rFonts w:ascii="Arial" w:hAnsi="Arial" w:cs="Arial" w:eastAsia="Arial"/>
+          <w:i/>
+          <w:iCs/>
+          <w:sz w:val="24"/>
+        </w:rPr>
+        <w:t xml:space="preserve">Journal of Social Studies Research</w:t>
+      </w:r>
+      <w:r>
+        <w:rPr>
+          <w:rFonts w:ascii="Arial" w:hAnsi="Arial" w:cs="Arial" w:eastAsia="Arial"/>
+          <w:sz w:val="24"/>
+        </w:rPr>
+        <w:t xml:space="preserve">. https://doi.org/10.1177/0885985X251385910</w:t>
+      </w:r>
+    </w:p>
+    <w:p>
+      <w:pPr>
+        <w:pStyle w:val="BodyText"/>
+        <w:spacing w:line="360" w:lineRule="auto" w:before="0" w:after="0"/>
+        <w:jc w:val="both"/>
+      </w:pPr>
+      <w:r>
+        <w:rPr>
+          <w:rFonts w:ascii="Arial" w:hAnsi="Arial" w:cs="Arial" w:eastAsia="Arial"/>
+          <w:sz w:val="24"/>
+        </w:rPr>
+        <w:t xml:space="preserve">Mishra, P., Warr, M., &amp; Islam, R. (2023). TPACK in the age of ChatGPT and generative AI.</w:t>
+      </w:r>
+      <w:r>
+        <w:rPr>
+          <w:rFonts w:ascii="Arial" w:hAnsi="Arial" w:cs="Arial" w:eastAsia="Arial"/>
+          <w:sz w:val="24"/>
+        </w:rPr>
+        <w:t xml:space="preserve"> </w:t>
+      </w:r>
+      <w:r>
+        <w:rPr>
+          <w:rFonts w:ascii="Arial" w:hAnsi="Arial" w:cs="Arial" w:eastAsia="Arial"/>
+          <w:i/>
+          <w:iCs/>
+          <w:sz w:val="24"/>
+        </w:rPr>
+        <w:t xml:space="preserve">Journal of Digital Learning in Teacher Education, 39</w:t>
+      </w:r>
+      <w:r>
+        <w:rPr>
+          <w:rFonts w:ascii="Arial" w:hAnsi="Arial" w:cs="Arial" w:eastAsia="Arial"/>
+          <w:sz w:val="24"/>
+        </w:rPr>
+        <w:t xml:space="preserve">(4), 235-251.</w:t>
+      </w:r>
+    </w:p>
+    <w:p>
+      <w:pPr>
+        <w:pStyle w:val="BodyText"/>
+        <w:spacing w:line="360" w:lineRule="auto" w:before="0" w:after="0"/>
+        <w:jc w:val="both"/>
+      </w:pPr>
+      <w:r>
+        <w:rPr>
+          <w:rFonts w:ascii="Arial" w:hAnsi="Arial" w:cs="Arial" w:eastAsia="Arial"/>
+          <w:sz w:val="24"/>
+        </w:rPr>
+        <w:t xml:space="preserve">Organisation for Economic Co-operation and Development. (2025).</w:t>
+      </w:r>
+      <w:r>
+        <w:rPr>
+          <w:rFonts w:ascii="Arial" w:hAnsi="Arial" w:cs="Arial" w:eastAsia="Arial"/>
+          <w:sz w:val="24"/>
+        </w:rPr>
+        <w:t xml:space="preserve"> </w:t>
+      </w:r>
+      <w:r>
+        <w:rPr>
+          <w:rFonts w:ascii="Arial" w:hAnsi="Arial" w:cs="Arial" w:eastAsia="Arial"/>
+          <w:i/>
+          <w:iCs/>
+          <w:sz w:val="24"/>
+        </w:rPr>
+        <w:t xml:space="preserve">Thriving in teaching: Results from TALIS 2024</w:t>
+      </w:r>
+      <w:r>
+        <w:rPr>
+          <w:rFonts w:ascii="Arial" w:hAnsi="Arial" w:cs="Arial" w:eastAsia="Arial"/>
+          <w:sz w:val="24"/>
+        </w:rPr>
+        <w:t xml:space="preserve">. OECD Publishing. https://www.oecd.org/en/publications/2025/10/results-from-talis-2024_28fbde1d.html</w:t>
+      </w:r>
+    </w:p>
+    <w:p>
+      <w:pPr>
+        <w:pStyle w:val="BodyText"/>
+        <w:spacing w:line="360" w:lineRule="auto" w:before="0" w:after="0"/>
+        <w:jc w:val="both"/>
+      </w:pPr>
+      <w:r>
+        <w:rPr>
+          <w:rFonts w:ascii="Arial" w:hAnsi="Arial" w:cs="Arial" w:eastAsia="Arial"/>
+          <w:sz w:val="24"/>
+        </w:rPr>
+        <w:t xml:space="preserve">Organización de las Naciones Unidas para la Educación, la Ciencia y la Cultura. (2023).</w:t>
+      </w:r>
+      <w:r>
+        <w:rPr>
+          <w:rFonts w:ascii="Arial" w:hAnsi="Arial" w:cs="Arial" w:eastAsia="Arial"/>
+          <w:sz w:val="24"/>
+        </w:rPr>
+        <w:t xml:space="preserve"> </w:t>
+      </w:r>
+      <w:r>
+        <w:rPr>
+          <w:rFonts w:ascii="Arial" w:hAnsi="Arial" w:cs="Arial" w:eastAsia="Arial"/>
+          <w:i/>
+          <w:iCs/>
+          <w:sz w:val="24"/>
+        </w:rPr>
+        <w:t xml:space="preserve">Guidance for generative AI in education and research</w:t>
+      </w:r>
+      <w:r>
+        <w:rPr>
+          <w:rFonts w:ascii="Arial" w:hAnsi="Arial" w:cs="Arial" w:eastAsia="Arial"/>
+          <w:sz w:val="24"/>
+        </w:rPr>
+        <w:t xml:space="preserve">. UNESCO. https://www.unesco.org/en/articles/guidance-generative-ai-education-and-research</w:t>
+      </w:r>
+    </w:p>
+    <w:p>
+      <w:pPr>
+        <w:pStyle w:val="BodyText"/>
+        <w:spacing w:line="360" w:lineRule="auto" w:before="0" w:after="0"/>
+        <w:jc w:val="both"/>
+      </w:pPr>
+      <w:r>
+        <w:rPr>
+          <w:rFonts w:ascii="Arial" w:hAnsi="Arial" w:cs="Arial" w:eastAsia="Arial"/>
+          <w:sz w:val="24"/>
+        </w:rPr>
+        <w:t xml:space="preserve">Secretaría de Educación Pública. (2022).</w:t>
+      </w:r>
+      <w:r>
+        <w:rPr>
+          <w:rFonts w:ascii="Arial" w:hAnsi="Arial" w:cs="Arial" w:eastAsia="Arial"/>
+          <w:sz w:val="24"/>
+        </w:rPr>
+        <w:t xml:space="preserve"> </w:t>
+      </w:r>
+      <w:r>
+        <w:rPr>
+          <w:rFonts w:ascii="Arial" w:hAnsi="Arial" w:cs="Arial" w:eastAsia="Arial"/>
+          <w:i/>
+          <w:iCs/>
+          <w:sz w:val="24"/>
+        </w:rPr>
+        <w:t xml:space="preserve">Marco Curricular Común de la Educación Media Superior</w:t>
+      </w:r>
+      <w:r>
+        <w:rPr>
+          <w:rFonts w:ascii="Arial" w:hAnsi="Arial" w:cs="Arial" w:eastAsia="Arial"/>
+          <w:sz w:val="24"/>
+        </w:rPr>
+        <w:t xml:space="preserve">. Subsecretaría de Educación Media Superior.</w:t>
+      </w:r>
+    </w:p>
+    <w:p>
+      <w:pPr>
+        <w:pStyle w:val="BodyText"/>
+        <w:spacing w:line="360" w:lineRule="auto" w:before="0" w:after="0"/>
+        <w:jc w:val="both"/>
+      </w:pPr>
+      <w:r>
+        <w:rPr>
+          <w:rFonts w:ascii="Arial" w:hAnsi="Arial" w:cs="Arial" w:eastAsia="Arial"/>
+          <w:sz w:val="24"/>
+        </w:rPr>
+        <w:t xml:space="preserve">Secretaría de Educación Pública. (2026).</w:t>
+      </w:r>
+      <w:r>
+        <w:rPr>
+          <w:rFonts w:ascii="Arial" w:hAnsi="Arial" w:cs="Arial" w:eastAsia="Arial"/>
+          <w:sz w:val="24"/>
+        </w:rPr>
+        <w:t xml:space="preserve"> </w:t>
+      </w:r>
+      <w:r>
+        <w:rPr>
+          <w:rFonts w:ascii="Arial" w:hAnsi="Arial" w:cs="Arial" w:eastAsia="Arial"/>
+          <w:i/>
+          <w:iCs/>
+          <w:sz w:val="24"/>
+        </w:rPr>
+        <w:t xml:space="preserve">Encuesta Nacional sobre Usos y Percepciones sobre la Inteligencia Artificial Generativa en la Educación Superior Mexicana (ENIAG) 2025: Dossier de resultados</w:t>
+      </w:r>
+      <w:r>
+        <w:rPr>
+          <w:rFonts w:ascii="Arial" w:hAnsi="Arial" w:cs="Arial" w:eastAsia="Arial"/>
+          <w:sz w:val="24"/>
+        </w:rPr>
+        <w:t xml:space="preserve">. Subsecretaría de Educación Superior. https://www.gob.mx/cms/uploads/attachment/file/1071411/Dossier_Resultados_ENIAG2025_SEP_.pdf</w:t>
+      </w:r>
+    </w:p>
+    <w:p>
+      <w:pPr>
+        <w:pStyle w:val="BodyText"/>
+        <w:spacing w:line="360" w:lineRule="auto" w:before="0" w:after="0"/>
+        <w:jc w:val="both"/>
+      </w:pPr>
+      <w:r>
+        <w:rPr>
+          <w:rFonts w:ascii="Arial" w:hAnsi="Arial" w:cs="Arial" w:eastAsia="Arial"/>
+          <w:sz w:val="24"/>
+        </w:rPr>
+        <w:t xml:space="preserve">Selwyn, N. (2019).</w:t>
+      </w:r>
+      <w:r>
+        <w:rPr>
+          <w:rFonts w:ascii="Arial" w:hAnsi="Arial" w:cs="Arial" w:eastAsia="Arial"/>
+          <w:sz w:val="24"/>
+        </w:rPr>
+        <w:t xml:space="preserve"> </w:t>
+      </w:r>
+      <w:r>
+        <w:rPr>
+          <w:rFonts w:ascii="Arial" w:hAnsi="Arial" w:cs="Arial" w:eastAsia="Arial"/>
+          <w:i/>
+          <w:iCs/>
+          <w:sz w:val="24"/>
+        </w:rPr>
+        <w:t xml:space="preserve">Should robots replace teachers? AI and the future of education</w:t>
+      </w:r>
+      <w:r>
+        <w:rPr>
+          <w:rFonts w:ascii="Arial" w:hAnsi="Arial" w:cs="Arial" w:eastAsia="Arial"/>
+          <w:sz w:val="24"/>
+        </w:rPr>
+        <w:t xml:space="preserve">. Polity Press.</w:t>
+      </w:r>
+    </w:p>
+    <w:p>
+      <w:pPr>
+        <w:pStyle w:val="BodyText"/>
+        <w:spacing w:line="360" w:lineRule="auto" w:before="0" w:after="0"/>
+        <w:jc w:val="both"/>
+      </w:pPr>
+      <w:r>
+        <w:rPr>
+          <w:rFonts w:ascii="Arial" w:hAnsi="Arial" w:cs="Arial" w:eastAsia="Arial"/>
+          <w:sz w:val="24"/>
+        </w:rPr>
+        <w:t xml:space="preserve">Varuvel Dennison, D., Ahtisham, B., Chourasia, K., Arora, N., Singh, R., Kizilcec, R. F., Nambi, A., Ganu, T., &amp; Vashistha, A. (2025).</w:t>
+      </w:r>
+      <w:r>
+        <w:rPr>
+          <w:rFonts w:ascii="Arial" w:hAnsi="Arial" w:cs="Arial" w:eastAsia="Arial"/>
+          <w:sz w:val="24"/>
+        </w:rPr>
+        <w:t xml:space="preserve"> </w:t>
+      </w:r>
+      <w:r>
+        <w:rPr>
+          <w:rFonts w:ascii="Arial" w:hAnsi="Arial" w:cs="Arial" w:eastAsia="Arial"/>
+          <w:i/>
+          <w:iCs/>
+          <w:sz w:val="24"/>
+        </w:rPr>
+        <w:t xml:space="preserve">Teacher-AI collaboration for curating and customizing lesson plans in low-resource schools</w:t>
+      </w:r>
+      <w:r>
+        <w:rPr>
+          <w:rFonts w:ascii="Arial" w:hAnsi="Arial" w:cs="Arial" w:eastAsia="Arial"/>
+          <w:sz w:val="24"/>
+        </w:rPr>
+        <w:t xml:space="preserve"> </w:t>
+      </w:r>
+      <w:r>
+        <w:rPr>
+          <w:rFonts w:ascii="Arial" w:hAnsi="Arial" w:cs="Arial" w:eastAsia="Arial"/>
+          <w:sz w:val="24"/>
+        </w:rPr>
+        <w:t xml:space="preserve">(arXiv:2507.00456). arXiv. https://arxiv.org/abs/2507.00456</w:t>
+      </w:r>
+    </w:p>
+    <w:bookmarkEnd w:id="23"/>
+    <w:bookmarkEnd w:id="24"/>
     <w:sectPr>
       <w:footnotePr>
         <w:numRestart w:val="eachSect"/>
       </w:footnotePr>
+      <w:pgMar w:left="1134" w:right="1134" w:top="1134" w:bottom="1134"/>
     </w:sectPr>
   </w:body>
 </w:document>
@@ -1387,82 +3317,6 @@
       <w:rPr>
         <w:rFonts w:ascii="Wingdings" w:hAnsi="Wingdings" w:cs="Wingdings" w:hint="default"/>
       </w:rPr>
-    </w:lvl>
-  </w:abstractNum>
-  <w:abstractNum w:abstractNumId="992">
-    <w:nsid w:val="0000A992"/>
-    <w:multiLevelType w:val="multilevel"/>
-    <w:lvl w:ilvl="0">
-      <w:numFmt w:val="bullet"/>
-      <w:lvlText w:val="☐"/>
-      <w:lvlJc w:val="left"/>
-      <w:pPr>
-        <w:ind w:left="720" w:hanging="360"/>
-      </w:pPr>
-    </w:lvl>
-    <w:lvl w:ilvl="1">
-      <w:numFmt w:val="bullet"/>
-      <w:lvlText w:val="☐"/>
-      <w:lvlJc w:val="left"/>
-      <w:pPr>
-        <w:ind w:left="1440" w:hanging="360"/>
-      </w:pPr>
-    </w:lvl>
-    <w:lvl w:ilvl="2">
-      <w:numFmt w:val="bullet"/>
-      <w:lvlText w:val="☐"/>
-      <w:lvlJc w:val="left"/>
-      <w:pPr>
-        <w:ind w:left="2160" w:hanging="360"/>
-      </w:pPr>
-    </w:lvl>
-    <w:lvl w:ilvl="3">
-      <w:numFmt w:val="bullet"/>
-      <w:lvlText w:val="☐"/>
-      <w:lvlJc w:val="left"/>
-      <w:pPr>
-        <w:ind w:left="2880" w:hanging="360"/>
-      </w:pPr>
-    </w:lvl>
-    <w:lvl w:ilvl="4">
-      <w:numFmt w:val="bullet"/>
-      <w:lvlText w:val="☐"/>
-      <w:lvlJc w:val="left"/>
-      <w:pPr>
-        <w:ind w:left="3600" w:hanging="360"/>
-      </w:pPr>
-    </w:lvl>
-    <w:lvl w:ilvl="5">
-      <w:numFmt w:val="bullet"/>
-      <w:lvlText w:val="☐"/>
-      <w:lvlJc w:val="left"/>
-      <w:pPr>
-        <w:ind w:left="4320" w:hanging="360"/>
-      </w:pPr>
-    </w:lvl>
-    <w:lvl w:ilvl="6">
-      <w:numFmt w:val="bullet"/>
-      <w:lvlText w:val="☐"/>
-      <w:lvlJc w:val="left"/>
-      <w:pPr>
-        <w:ind w:left="5040" w:hanging="360"/>
-      </w:pPr>
-    </w:lvl>
-    <w:lvl w:ilvl="7">
-      <w:numFmt w:val="bullet"/>
-      <w:lvlText w:val="☐"/>
-      <w:lvlJc w:val="left"/>
-      <w:pPr>
-        <w:ind w:left="5760" w:hanging="360"/>
-      </w:pPr>
-    </w:lvl>
-    <w:lvl w:ilvl="8">
-      <w:numFmt w:val="bullet"/>
-      <w:lvlText w:val="☐"/>
-      <w:lvlJc w:val="left"/>
-      <w:pPr>
-        <w:ind w:left="6480" w:hanging="360"/>
-      </w:pPr>
     </w:lvl>
   </w:abstractNum>
   <w:num w:numId="1000">
@@ -1529,25 +3383,67 @@
     </w:lvlOverride>
   </w:num>
   <w:num w:numId="1003">
-    <w:abstractNumId w:val="991"/>
+    <w:abstractNumId w:val="99411"/>
+    <w:lvlOverride w:ilvl="0">
+      <w:startOverride w:val="1"/>
+    </w:lvlOverride>
+    <w:lvlOverride w:ilvl="1">
+      <w:startOverride w:val="1"/>
+    </w:lvlOverride>
+    <w:lvlOverride w:ilvl="2">
+      <w:startOverride w:val="1"/>
+    </w:lvlOverride>
+    <w:lvlOverride w:ilvl="3">
+      <w:startOverride w:val="1"/>
+    </w:lvlOverride>
+    <w:lvlOverride w:ilvl="4">
+      <w:startOverride w:val="1"/>
+    </w:lvlOverride>
+    <w:lvlOverride w:ilvl="5">
+      <w:startOverride w:val="1"/>
+    </w:lvlOverride>
+    <w:lvlOverride w:ilvl="6">
+      <w:startOverride w:val="1"/>
+    </w:lvlOverride>
+    <w:lvlOverride w:ilvl="7">
+      <w:startOverride w:val="1"/>
+    </w:lvlOverride>
+    <w:lvlOverride w:ilvl="8">
+      <w:startOverride w:val="1"/>
+    </w:lvlOverride>
   </w:num>
   <w:num w:numId="1004">
     <w:abstractNumId w:val="991"/>
   </w:num>
   <w:num w:numId="1005">
-    <w:abstractNumId w:val="992"/>
-  </w:num>
-  <w:num w:numId="1006">
-    <w:abstractNumId w:val="992"/>
-  </w:num>
-  <w:num w:numId="1007">
-    <w:abstractNumId w:val="992"/>
-  </w:num>
-  <w:num w:numId="1008">
-    <w:abstractNumId w:val="992"/>
-  </w:num>
-  <w:num w:numId="1009">
-    <w:abstractNumId w:val="992"/>
+    <w:abstractNumId w:val="99411"/>
+    <w:lvlOverride w:ilvl="0">
+      <w:startOverride w:val="1"/>
+    </w:lvlOverride>
+    <w:lvlOverride w:ilvl="1">
+      <w:startOverride w:val="1"/>
+    </w:lvlOverride>
+    <w:lvlOverride w:ilvl="2">
+      <w:startOverride w:val="1"/>
+    </w:lvlOverride>
+    <w:lvlOverride w:ilvl="3">
+      <w:startOverride w:val="1"/>
+    </w:lvlOverride>
+    <w:lvlOverride w:ilvl="4">
+      <w:startOverride w:val="1"/>
+    </w:lvlOverride>
+    <w:lvlOverride w:ilvl="5">
+      <w:startOverride w:val="1"/>
+    </w:lvlOverride>
+    <w:lvlOverride w:ilvl="6">
+      <w:startOverride w:val="1"/>
+    </w:lvlOverride>
+    <w:lvlOverride w:ilvl="7">
+      <w:startOverride w:val="1"/>
+    </w:lvlOverride>
+    <w:lvlOverride w:ilvl="8">
+      <w:startOverride w:val="1"/>
+    </w:lvlOverride>
   </w:num>
 </w:numbering>
 </file>
@@ -1573,6 +3469,10 @@
   <w:style w:default="1" w:styleId="Normal" w:type="paragraph">
     <w:name w:val="Normal"/>
     <w:qFormat/>
+    <w:rPr>
+      <w:rFonts w:ascii="Arial" w:hAnsi="Arial" w:cs="Arial" w:eastAsia="Arial"/>
+      <w:sz w:val="24"/>
+    </w:rPr>
   </w:style>
   <w:style w:styleId="BodyText" w:type="paragraph">
     <w:name w:val="Body Text"/>

</xml_diff>